<commit_message>
Rapport v2.1 second draft: bibliografi sortert (APA 7), engelsk Abstract, Figur 7.6 ærlig caption, trimmet til 11 970 ord
Kontrollkjoring mot kompendiet/transkripsjoner/bibliografi avdekket tre
funn som er fikset her:

- F1 Bibliografi: alfabetisk APA 7-sortering (Friedman -> Su) i stedet
  for den vilkarlige rekkefolgen som sto i v1.1.
- F2 Engelsk Abstract: lagt til etter Sammendrag for a oppfylle malen
  Mal prosjekt LOG650 v2.docx som krever bade norsk og engelsk
  sammendrag.
- F3 Figur 7.6 caption: oppdatert til a vere ærlig om at figuren er
  LightGBM gain-importance (fallback) og ikke SHAP summary -
  TreeSHAP-generering feilet, jf. § 9.7. Bold-paragrafen utdyper at
  fortegns-informasjon mangler og at regenerering med ekte TreeSHAP
  er flagget som videre arbeid.

Ordtelling (Word-stil): 11 970 ord (30 ord under 12 000-grensen).
Trimming: versjonsnote 140 -> 60 ord, Abstract 170 -> 145 ord.

Co-Authored-By: Claude Opus 4.7 <noreply@anthropic.com>
</commit_message>
<xml_diff>
--- a/014 fase 4 - report/Final report second draft v1.docx
+++ b/014 fase 4 - report/Final report second draft v1.docx
@@ -92,35 +92,35 @@
           <w:bCs/>
           <w:sz w:val="24"/>
         </w:rPr>
-        <w:t xml:space="preserve">Versjon 2.0 — 2026-05-25.</w:t>
-      </w:r>
-      <w:r>
-        <w:rPr>
-          <w:rFonts w:ascii="Times New Roman" w:hAnsi="Times New Roman" w:cs="Times New Roman" w:eastAsia="Times New Roman"/>
-          <w:sz w:val="24"/>
-        </w:rPr>
-        <w:t xml:space="preserve"> </w:t>
-      </w:r>
-      <w:r>
-        <w:rPr>
-          <w:rFonts w:ascii="Times New Roman" w:hAnsi="Times New Roman" w:cs="Times New Roman" w:eastAsia="Times New Roman"/>
-          <w:sz w:val="24"/>
-        </w:rPr>
-        <w:t xml:space="preserve">Andre utkast (second draft) etter egen gjennomgang av first draft. Endringer fra v1.1: navneretting (Renè → Rene), kapittelnummerering ryddet (Sammendrag uten nummer, ingen dobbel nummerering på under</w:t>
-      </w:r>
-      <w:r>
-        <w:rPr>
-          <w:rFonts w:ascii="Times New Roman" w:hAnsi="Times New Roman" w:cs="Times New Roman" w:eastAsia="Times New Roman"/>
-          <w:sz w:val="24"/>
-        </w:rPr>
-        <w:softHyphen/>
-      </w:r>
-      <w:r>
-        <w:rPr>
-          <w:rFonts w:ascii="Times New Roman" w:hAnsi="Times New Roman" w:cs="Times New Roman" w:eastAsia="Times New Roman"/>
-          <w:sz w:val="24"/>
-        </w:rPr>
-        <w:t xml:space="preserve">kapitler), beskrivende figurtekster,</w:t>
+        <w:t xml:space="preserve">Versjon 2.1 — 2026-05-25.</w:t>
+      </w:r>
+      <w:r>
+        <w:rPr>
+          <w:rFonts w:ascii="Times New Roman" w:hAnsi="Times New Roman" w:cs="Times New Roman" w:eastAsia="Times New Roman"/>
+          <w:sz w:val="24"/>
+        </w:rPr>
+        <w:t xml:space="preserve"> </w:t>
+      </w:r>
+      <w:r>
+        <w:rPr>
+          <w:rFonts w:ascii="Times New Roman" w:hAnsi="Times New Roman" w:cs="Times New Roman" w:eastAsia="Times New Roman"/>
+          <w:sz w:val="24"/>
+        </w:rPr>
+        <w:t xml:space="preserve">Andre utkast. Endringer fra v1.1: navneretting (Renè → Rene), kapittel</w:t>
+      </w:r>
+      <w:r>
+        <w:rPr>
+          <w:rFonts w:ascii="Times New Roman" w:hAnsi="Times New Roman" w:cs="Times New Roman" w:eastAsia="Times New Roman"/>
+          <w:sz w:val="24"/>
+        </w:rPr>
+        <w:softHyphen/>
+      </w:r>
+      <w:r>
+        <w:rPr>
+          <w:rFonts w:ascii="Times New Roman" w:hAnsi="Times New Roman" w:cs="Times New Roman" w:eastAsia="Times New Roman"/>
+          <w:sz w:val="24"/>
+        </w:rPr>
+        <w:t xml:space="preserve">nummerering ryddet, beskrivende figurtekster,</w:t>
       </w:r>
       <w:r>
         <w:rPr>
@@ -141,7 +141,14 @@
           <w:rFonts w:ascii="Times New Roman" w:hAnsi="Times New Roman" w:cs="Times New Roman" w:eastAsia="Times New Roman"/>
           <w:sz w:val="24"/>
         </w:rPr>
-        <w:t xml:space="preserve">-seksjon lagt til, Word-eksport i Times New Roman 12 pt med 1,5 linjeavstand.</w:t>
+        <w:t xml:space="preserve"> </w:t>
+      </w:r>
+      <w:r>
+        <w:rPr>
+          <w:rFonts w:ascii="Times New Roman" w:hAnsi="Times New Roman" w:cs="Times New Roman" w:eastAsia="Times New Roman"/>
+          <w:sz w:val="24"/>
+        </w:rPr>
+        <w:t xml:space="preserve">og engelsk Abstract lagt til (jf. malen), bibliografi alfabetisk sortert (APA 7), Figur 7.6-caption rettet til ærlig gain-importance (jf. § 9.7), TNR 12 pt + 1,5 linjeavstand i Word.</w:t>
       </w:r>
     </w:p>
     <w:p>
@@ -330,7 +337,7 @@
       </w:r>
     </w:p>
     <w:bookmarkEnd w:id="9"/>
-    <w:bookmarkStart w:id="10" w:name="takk-til"/>
+    <w:bookmarkStart w:id="10" w:name="abstract"/>
     <w:p>
       <w:pPr>
         <w:pStyle w:val="Heading2"/>
@@ -341,7 +348,7 @@
           <w:rFonts w:ascii="Times New Roman" w:hAnsi="Times New Roman" w:cs="Times New Roman" w:eastAsia="Times New Roman"/>
           <w:sz w:val="24"/>
         </w:rPr>
-        <w:t xml:space="preserve">Takk til</w:t>
+        <w:t xml:space="preserve">Abstract</w:t>
       </w:r>
     </w:p>
     <w:p>
@@ -354,7 +361,35 @@
           <w:rFonts w:ascii="Times New Roman" w:hAnsi="Times New Roman" w:cs="Times New Roman" w:eastAsia="Times New Roman"/>
           <w:sz w:val="24"/>
         </w:rPr>
-        <w:t xml:space="preserve">Denne rapporten er resultatet av et selvstendig prosjekt som har dratt nytte av flere bidragsytere. Først og fremst takk til</w:t>
+        <w:t xml:space="preserve">NautiCost is a pre-arrival decision-support tool that estimates the total cost of a super</w:t>
+      </w:r>
+      <w:r>
+        <w:rPr>
+          <w:rFonts w:ascii="Times New Roman" w:hAnsi="Times New Roman" w:cs="Times New Roman" w:eastAsia="Times New Roman"/>
+          <w:sz w:val="24"/>
+        </w:rPr>
+        <w:softHyphen/>
+      </w:r>
+      <w:r>
+        <w:rPr>
+          <w:rFonts w:ascii="Times New Roman" w:hAnsi="Times New Roman" w:cs="Times New Roman" w:eastAsia="Times New Roman"/>
+          <w:sz w:val="24"/>
+        </w:rPr>
+        <w:t xml:space="preserve">yacht port call in Norway, Sweden or Denmark. Trained on 1,647 service transactions (2020–2025) from Yachting Operations covering 17 yachts, it follows a curriculum-anchored methodology (Pettersen &amp; Rekdal, 2026, Table 1.1): gradient boosting, cross-validation, SHAP and hyper</w:t>
+      </w:r>
+      <w:r>
+        <w:rPr>
+          <w:rFonts w:ascii="Times New Roman" w:hAnsi="Times New Roman" w:cs="Times New Roman" w:eastAsia="Times New Roman"/>
+          <w:sz w:val="24"/>
+        </w:rPr>
+        <w:softHyphen/>
+      </w:r>
+      <w:r>
+        <w:rPr>
+          <w:rFonts w:ascii="Times New Roman" w:hAnsi="Times New Roman" w:cs="Times New Roman" w:eastAsia="Times New Roman"/>
+          <w:sz w:val="24"/>
+        </w:rPr>
+        <w:t xml:space="preserve">parameter tuning. Cost is modelled per transaction with a log-transformed target and a LightGBM + CatBoost ensemble, then aggregated via port templates and traffic weights, and calibrated against empirical P25/P50/P75 percentiles per (port, size). Source data are in EUR; the frontend converts to NOK/DKK at the API boundary. Validation (2024, n = 490):</w:t>
       </w:r>
       <w:r>
         <w:rPr>
@@ -370,65 +405,21 @@
           <w:bCs/>
           <w:sz w:val="24"/>
         </w:rPr>
-        <w:t xml:space="preserve">Yachting Operations</w:t>
-      </w:r>
-      <w:r>
-        <w:rPr>
-          <w:rFonts w:ascii="Times New Roman" w:hAnsi="Times New Roman" w:cs="Times New Roman" w:eastAsia="Times New Roman"/>
-          <w:sz w:val="24"/>
-        </w:rPr>
-        <w:t xml:space="preserve"> </w:t>
-      </w:r>
-      <w:r>
-        <w:rPr>
-          <w:rFonts w:ascii="Times New Roman" w:hAnsi="Times New Roman" w:cs="Times New Roman" w:eastAsia="Times New Roman"/>
-          <w:sz w:val="24"/>
-        </w:rPr>
-        <w:t xml:space="preserve">for å ha stilt 2020–2025-fakturadata og yacht</w:t>
-      </w:r>
-      <w:r>
-        <w:rPr>
-          <w:rFonts w:ascii="Times New Roman" w:hAnsi="Times New Roman" w:cs="Times New Roman" w:eastAsia="Times New Roman"/>
-          <w:sz w:val="24"/>
-        </w:rPr>
-        <w:softHyphen/>
-      </w:r>
-      <w:r>
-        <w:rPr>
-          <w:rFonts w:ascii="Times New Roman" w:hAnsi="Times New Roman" w:cs="Times New Roman" w:eastAsia="Times New Roman"/>
-          <w:sz w:val="24"/>
-        </w:rPr>
-        <w:t xml:space="preserve">spesifikasjoner til disposisjon, og til</w:t>
-      </w:r>
-      <w:r>
-        <w:rPr>
-          <w:rFonts w:ascii="Times New Roman" w:hAnsi="Times New Roman" w:cs="Times New Roman" w:eastAsia="Times New Roman"/>
-          <w:sz w:val="24"/>
-        </w:rPr>
-        <w:t xml:space="preserve"> </w:t>
-      </w:r>
-      <w:r>
-        <w:rPr>
-          <w:rFonts w:ascii="Times New Roman" w:hAnsi="Times New Roman" w:cs="Times New Roman" w:eastAsia="Times New Roman"/>
-          <w:i/>
-          <w:iCs/>
-          <w:sz w:val="24"/>
-        </w:rPr>
-        <w:t xml:space="preserve">agency manager</w:t>
-      </w:r>
-      <w:r>
-        <w:rPr>
-          <w:rFonts w:ascii="Times New Roman" w:hAnsi="Times New Roman" w:cs="Times New Roman" w:eastAsia="Times New Roman"/>
-          <w:sz w:val="24"/>
-        </w:rPr>
-        <w:t xml:space="preserve"> </w:t>
-      </w:r>
-      <w:r>
-        <w:rPr>
-          <w:rFonts w:ascii="Times New Roman" w:hAnsi="Times New Roman" w:cs="Times New Roman" w:eastAsia="Times New Roman"/>
-          <w:sz w:val="24"/>
-        </w:rPr>
-        <w:t xml:space="preserve">som tok seg tid til brukertesten i mai 2026 — funnene i § 9.5 hadde ikke vært mulige uten denne dialogen. Videre takk til foreleserne</w:t>
+        <w:t xml:space="preserve">MAE = €17,350 / wMAPE = 71.4 %</w:t>
+      </w:r>
+      <w:r>
+        <w:rPr>
+          <w:rFonts w:ascii="Times New Roman" w:hAnsi="Times New Roman" w:cs="Times New Roman" w:eastAsia="Times New Roman"/>
+          <w:sz w:val="24"/>
+        </w:rPr>
+        <w:t xml:space="preserve"> </w:t>
+      </w:r>
+      <w:r>
+        <w:rPr>
+          <w:rFonts w:ascii="Times New Roman" w:hAnsi="Times New Roman" w:cs="Times New Roman" w:eastAsia="Times New Roman"/>
+          <w:sz w:val="24"/>
+        </w:rPr>
+        <w:t xml:space="preserve">— 20 % better than median baseline. Hold-out test (2025, n = 649):</w:t>
       </w:r>
       <w:r>
         <w:rPr>
@@ -444,174 +435,21 @@
           <w:bCs/>
           <w:sz w:val="24"/>
         </w:rPr>
-        <w:t xml:space="preserve">Bjørn-Inge Pettersen</w:t>
-      </w:r>
-      <w:r>
-        <w:rPr>
-          <w:rFonts w:ascii="Times New Roman" w:hAnsi="Times New Roman" w:cs="Times New Roman" w:eastAsia="Times New Roman"/>
-          <w:sz w:val="24"/>
-        </w:rPr>
-        <w:t xml:space="preserve"> </w:t>
-      </w:r>
-      <w:r>
-        <w:rPr>
-          <w:rFonts w:ascii="Times New Roman" w:hAnsi="Times New Roman" w:cs="Times New Roman" w:eastAsia="Times New Roman"/>
-          <w:sz w:val="24"/>
-        </w:rPr>
-        <w:t xml:space="preserve">og</w:t>
-      </w:r>
-      <w:r>
-        <w:rPr>
-          <w:rFonts w:ascii="Times New Roman" w:hAnsi="Times New Roman" w:cs="Times New Roman" w:eastAsia="Times New Roman"/>
-          <w:sz w:val="24"/>
-        </w:rPr>
-        <w:t xml:space="preserve"> </w:t>
-      </w:r>
-      <w:r>
-        <w:rPr>
-          <w:rFonts w:ascii="Times New Roman" w:hAnsi="Times New Roman" w:cs="Times New Roman" w:eastAsia="Times New Roman"/>
-          <w:b/>
-          <w:bCs/>
-          <w:sz w:val="24"/>
-        </w:rPr>
-        <w:t xml:space="preserve">Per Kristian Rekdal</w:t>
-      </w:r>
-      <w:r>
-        <w:rPr>
-          <w:rFonts w:ascii="Times New Roman" w:hAnsi="Times New Roman" w:cs="Times New Roman" w:eastAsia="Times New Roman"/>
-          <w:sz w:val="24"/>
-        </w:rPr>
-        <w:t xml:space="preserve"> </w:t>
-      </w:r>
-      <w:r>
-        <w:rPr>
-          <w:rFonts w:ascii="Times New Roman" w:hAnsi="Times New Roman" w:cs="Times New Roman" w:eastAsia="Times New Roman"/>
-          <w:sz w:val="24"/>
-        </w:rPr>
-        <w:t xml:space="preserve">for kompendiet</w:t>
-      </w:r>
-      <w:r>
-        <w:rPr>
-          <w:rFonts w:ascii="Times New Roman" w:hAnsi="Times New Roman" w:cs="Times New Roman" w:eastAsia="Times New Roman"/>
-          <w:sz w:val="24"/>
-        </w:rPr>
-        <w:t xml:space="preserve"> </w:t>
-      </w:r>
-      <w:r>
-        <w:rPr>
-          <w:rFonts w:ascii="Times New Roman" w:hAnsi="Times New Roman" w:cs="Times New Roman" w:eastAsia="Times New Roman"/>
-          <w:i/>
-          <w:iCs/>
-          <w:sz w:val="24"/>
-        </w:rPr>
-        <w:t xml:space="preserve">Kvantitative metoder i logistikk — implementert via KI</w:t>
-      </w:r>
-      <w:r>
-        <w:rPr>
-          <w:rFonts w:ascii="Times New Roman" w:hAnsi="Times New Roman" w:cs="Times New Roman" w:eastAsia="Times New Roman"/>
-          <w:sz w:val="24"/>
-        </w:rPr>
-        <w:t xml:space="preserve"> </w:t>
-      </w:r>
-      <w:r>
-        <w:rPr>
-          <w:rFonts w:ascii="Times New Roman" w:hAnsi="Times New Roman" w:cs="Times New Roman" w:eastAsia="Times New Roman"/>
-          <w:sz w:val="24"/>
-        </w:rPr>
-        <w:t xml:space="preserve">(2026) og for veiledning gjennom semesteret; metodevalget i NautiCost er direkte forankret i deres rammeverk (§ 2.2 og § 5.0). Takk også til medstudent i Gruppe 10 (Julie) for grundig peer-review 2026-05-07, hvis innspill er sporet og lukket i § 9.7.</w:t>
-      </w:r>
-    </w:p>
-    <w:p>
-      <w:pPr>
-        <w:pStyle w:val="BodyText"/>
-        <w:spacing w:line="360" w:lineRule="auto"/>
-      </w:pPr>
-      <w:r>
-        <w:rPr>
-          <w:rFonts w:ascii="Times New Roman" w:hAnsi="Times New Roman" w:cs="Times New Roman" w:eastAsia="Times New Roman"/>
-          <w:sz w:val="24"/>
-        </w:rPr>
-        <w:t xml:space="preserve">Til slutt en åpen merknad om AI-bruk: deler av koden, figurene og rapport</w:t>
-      </w:r>
-      <w:r>
-        <w:rPr>
-          <w:rFonts w:ascii="Times New Roman" w:hAnsi="Times New Roman" w:cs="Times New Roman" w:eastAsia="Times New Roman"/>
-          <w:sz w:val="24"/>
-        </w:rPr>
-        <w:softHyphen/>
-      </w:r>
-      <w:r>
-        <w:rPr>
-          <w:rFonts w:ascii="Times New Roman" w:hAnsi="Times New Roman" w:cs="Times New Roman" w:eastAsia="Times New Roman"/>
-          <w:sz w:val="24"/>
-        </w:rPr>
-        <w:t xml:space="preserve">teksten er utviklet i samarbeid med</w:t>
-      </w:r>
-      <w:r>
-        <w:rPr>
-          <w:rFonts w:ascii="Times New Roman" w:hAnsi="Times New Roman" w:cs="Times New Roman" w:eastAsia="Times New Roman"/>
-          <w:sz w:val="24"/>
-        </w:rPr>
-        <w:t xml:space="preserve"> </w:t>
-      </w:r>
-      <w:r>
-        <w:rPr>
-          <w:rFonts w:ascii="Times New Roman" w:hAnsi="Times New Roman" w:cs="Times New Roman" w:eastAsia="Times New Roman"/>
-          <w:b/>
-          <w:bCs/>
-          <w:sz w:val="24"/>
-        </w:rPr>
-        <w:t xml:space="preserve">Anthropic Claude</w:t>
-      </w:r>
-      <w:r>
-        <w:rPr>
-          <w:rFonts w:ascii="Times New Roman" w:hAnsi="Times New Roman" w:cs="Times New Roman" w:eastAsia="Times New Roman"/>
-          <w:sz w:val="24"/>
-        </w:rPr>
-        <w:t xml:space="preserve"> </w:t>
-      </w:r>
-      <w:r>
-        <w:rPr>
-          <w:rFonts w:ascii="Times New Roman" w:hAnsi="Times New Roman" w:cs="Times New Roman" w:eastAsia="Times New Roman"/>
-          <w:sz w:val="24"/>
-        </w:rPr>
-        <w:t xml:space="preserve">(Claude Code i terminal), i tråd med høgskolens retningslinjer om transparent KI-bruk. Alle resultat</w:t>
-      </w:r>
-      <w:r>
-        <w:rPr>
-          <w:rFonts w:ascii="Times New Roman" w:hAnsi="Times New Roman" w:cs="Times New Roman" w:eastAsia="Times New Roman"/>
-          <w:sz w:val="24"/>
-        </w:rPr>
-        <w:softHyphen/>
-      </w:r>
-      <w:r>
-        <w:rPr>
-          <w:rFonts w:ascii="Times New Roman" w:hAnsi="Times New Roman" w:cs="Times New Roman" w:eastAsia="Times New Roman"/>
-          <w:sz w:val="24"/>
-        </w:rPr>
-        <w:t xml:space="preserve">tall er likevel verifisert mot kildedata og reproduserbare via skriptene i</w:t>
-      </w:r>
-      <w:r>
-        <w:rPr>
-          <w:rFonts w:ascii="Times New Roman" w:hAnsi="Times New Roman" w:cs="Times New Roman" w:eastAsia="Times New Roman"/>
-          <w:sz w:val="24"/>
-        </w:rPr>
-        <w:t xml:space="preserve"> </w:t>
-      </w:r>
-      <w:r>
-        <w:rPr>
-          <w:rStyle w:val="VerbatimChar"/>
-          <w:rFonts w:ascii="Times New Roman" w:hAnsi="Times New Roman" w:cs="Times New Roman" w:eastAsia="Times New Roman"/>
-          <w:sz w:val="24"/>
-        </w:rPr>
-        <w:t xml:space="preserve">013 fase 3 - review/</w:t>
-      </w:r>
-      <w:r>
-        <w:rPr>
-          <w:rFonts w:ascii="Times New Roman" w:hAnsi="Times New Roman" w:cs="Times New Roman" w:eastAsia="Times New Roman"/>
-          <w:sz w:val="24"/>
-        </w:rPr>
-        <w:t xml:space="preserve">.</w:t>
+        <w:t xml:space="preserve">MAE = €19,051 / wMAPE = 74.3 %</w:t>
+      </w:r>
+      <w:r>
+        <w:rPr>
+          <w:rFonts w:ascii="Times New Roman" w:hAnsi="Times New Roman" w:cs="Times New Roman" w:eastAsia="Times New Roman"/>
+          <w:sz w:val="24"/>
+        </w:rPr>
+        <w:t xml:space="preserve"> </w:t>
+      </w:r>
+      <w:r>
+        <w:rPr>
+          <w:rFonts w:ascii="Times New Roman" w:hAnsi="Times New Roman" w:cs="Times New Roman" w:eastAsia="Times New Roman"/>
+          <w:sz w:val="24"/>
+        </w:rPr>
+        <w:t xml:space="preserve">— a ≈ 10 % val→test degradation, as expected from model selection. Deployed as FastAPI + Next.js with sub-two-second response.</w:t>
       </w:r>
     </w:p>
     <w:p>
@@ -629,7 +467,7 @@
       </w:r>
     </w:p>
     <w:bookmarkEnd w:id="10"/>
-    <w:bookmarkStart w:id="16" w:name="innledning"/>
+    <w:bookmarkStart w:id="11" w:name="takk-til"/>
     <w:p>
       <w:pPr>
         <w:pStyle w:val="Heading2"/>
@@ -640,7 +478,7 @@
           <w:rFonts w:ascii="Times New Roman" w:hAnsi="Times New Roman" w:cs="Times New Roman" w:eastAsia="Times New Roman"/>
           <w:sz w:val="24"/>
         </w:rPr>
-        <w:t xml:space="preserve">1. Innledning</w:t>
+        <w:t xml:space="preserve">Takk til</w:t>
       </w:r>
     </w:p>
     <w:p>
@@ -653,76 +491,51 @@
           <w:rFonts w:ascii="Times New Roman" w:hAnsi="Times New Roman" w:cs="Times New Roman" w:eastAsia="Times New Roman"/>
           <w:sz w:val="24"/>
         </w:rPr>
-        <w:t xml:space="preserve">Internasjonale superyachter genererer betydelige tjeneste</w:t>
-      </w:r>
-      <w:r>
-        <w:rPr>
-          <w:rFonts w:ascii="Times New Roman" w:hAnsi="Times New Roman" w:cs="Times New Roman" w:eastAsia="Times New Roman"/>
-          <w:sz w:val="24"/>
-        </w:rPr>
-        <w:softHyphen/>
-      </w:r>
-      <w:r>
-        <w:rPr>
-          <w:rFonts w:ascii="Times New Roman" w:hAnsi="Times New Roman" w:cs="Times New Roman" w:eastAsia="Times New Roman"/>
-          <w:sz w:val="24"/>
-        </w:rPr>
-        <w:t xml:space="preserve">inntekter for skandinaviske havneagenter, men kostnadsbildet ved et havneanløp er komplekst: ett anløp består typisk av 5–40 separate transaksjoner fordelt på havneavgift, los, hospitality, proviant, agenttjenester og bunkers. I dag estimeres totalkost</w:t>
-      </w:r>
-      <w:r>
-        <w:rPr>
-          <w:rFonts w:ascii="Times New Roman" w:hAnsi="Times New Roman" w:cs="Times New Roman" w:eastAsia="Times New Roman"/>
-          <w:sz w:val="24"/>
-        </w:rPr>
-        <w:softHyphen/>
-      </w:r>
-      <w:r>
-        <w:rPr>
-          <w:rFonts w:ascii="Times New Roman" w:hAnsi="Times New Roman" w:cs="Times New Roman" w:eastAsia="Times New Roman"/>
-          <w:sz w:val="24"/>
-        </w:rPr>
-        <w:t xml:space="preserve">naden manuelt av agent</w:t>
-      </w:r>
-      <w:r>
-        <w:rPr>
-          <w:rFonts w:ascii="Times New Roman" w:hAnsi="Times New Roman" w:cs="Times New Roman" w:eastAsia="Times New Roman"/>
-          <w:sz w:val="24"/>
-        </w:rPr>
-        <w:softHyphen/>
-      </w:r>
-      <w:r>
-        <w:rPr>
-          <w:rFonts w:ascii="Times New Roman" w:hAnsi="Times New Roman" w:cs="Times New Roman" w:eastAsia="Times New Roman"/>
-          <w:sz w:val="24"/>
-        </w:rPr>
-        <w:t xml:space="preserve">koordinator basert på erfaring og oppslag i tidligere fakturaer, hvilket er tidkrevende og inkonsistent. Resultatet er at yachteiere ofte mottar grove anslag som senere må justeres.</w:t>
-      </w:r>
-    </w:p>
-    <w:p>
-      <w:pPr>
-        <w:pStyle w:val="BodyText"/>
-        <w:spacing w:line="360" w:lineRule="auto"/>
-      </w:pPr>
-      <w:r>
-        <w:rPr>
-          <w:rFonts w:ascii="Times New Roman" w:hAnsi="Times New Roman" w:cs="Times New Roman" w:eastAsia="Times New Roman"/>
-          <w:sz w:val="24"/>
-        </w:rPr>
-        <w:t xml:space="preserve">Dette prosjektet utvikler et datadrevet estimerings</w:t>
-      </w:r>
-      <w:r>
-        <w:rPr>
-          <w:rFonts w:ascii="Times New Roman" w:hAnsi="Times New Roman" w:cs="Times New Roman" w:eastAsia="Times New Roman"/>
-          <w:sz w:val="24"/>
-        </w:rPr>
-        <w:softHyphen/>
-      </w:r>
-      <w:r>
-        <w:rPr>
-          <w:rFonts w:ascii="Times New Roman" w:hAnsi="Times New Roman" w:cs="Times New Roman" w:eastAsia="Times New Roman"/>
-          <w:sz w:val="24"/>
-        </w:rPr>
-        <w:t xml:space="preserve">verktøy —</w:t>
+        <w:t xml:space="preserve">Denne rapporten er resultatet av et selvstendig prosjekt som har dratt nytte av flere bidragsytere. Først og fremst takk til</w:t>
+      </w:r>
+      <w:r>
+        <w:rPr>
+          <w:rFonts w:ascii="Times New Roman" w:hAnsi="Times New Roman" w:cs="Times New Roman" w:eastAsia="Times New Roman"/>
+          <w:sz w:val="24"/>
+        </w:rPr>
+        <w:t xml:space="preserve"> </w:t>
+      </w:r>
+      <w:r>
+        <w:rPr>
+          <w:rFonts w:ascii="Times New Roman" w:hAnsi="Times New Roman" w:cs="Times New Roman" w:eastAsia="Times New Roman"/>
+          <w:b/>
+          <w:bCs/>
+          <w:sz w:val="24"/>
+        </w:rPr>
+        <w:t xml:space="preserve">Yachting Operations</w:t>
+      </w:r>
+      <w:r>
+        <w:rPr>
+          <w:rFonts w:ascii="Times New Roman" w:hAnsi="Times New Roman" w:cs="Times New Roman" w:eastAsia="Times New Roman"/>
+          <w:sz w:val="24"/>
+        </w:rPr>
+        <w:t xml:space="preserve"> </w:t>
+      </w:r>
+      <w:r>
+        <w:rPr>
+          <w:rFonts w:ascii="Times New Roman" w:hAnsi="Times New Roman" w:cs="Times New Roman" w:eastAsia="Times New Roman"/>
+          <w:sz w:val="24"/>
+        </w:rPr>
+        <w:t xml:space="preserve">for å ha stilt 2020–2025-fakturadata og yacht</w:t>
+      </w:r>
+      <w:r>
+        <w:rPr>
+          <w:rFonts w:ascii="Times New Roman" w:hAnsi="Times New Roman" w:cs="Times New Roman" w:eastAsia="Times New Roman"/>
+          <w:sz w:val="24"/>
+        </w:rPr>
+        <w:softHyphen/>
+      </w:r>
+      <w:r>
+        <w:rPr>
+          <w:rFonts w:ascii="Times New Roman" w:hAnsi="Times New Roman" w:cs="Times New Roman" w:eastAsia="Times New Roman"/>
+          <w:sz w:val="24"/>
+        </w:rPr>
+        <w:t xml:space="preserve">spesifikasjoner til disposisjon, og til</w:t>
       </w:r>
       <w:r>
         <w:rPr>
@@ -738,70 +551,29 @@
           <w:iCs/>
           <w:sz w:val="24"/>
         </w:rPr>
-        <w:t xml:space="preserve">NautiCost</w:t>
-      </w:r>
-      <w:r>
-        <w:rPr>
-          <w:rFonts w:ascii="Times New Roman" w:hAnsi="Times New Roman" w:cs="Times New Roman" w:eastAsia="Times New Roman"/>
-          <w:sz w:val="24"/>
-        </w:rPr>
-        <w:t xml:space="preserve"> </w:t>
-      </w:r>
-      <w:r>
-        <w:rPr>
-          <w:rFonts w:ascii="Times New Roman" w:hAnsi="Times New Roman" w:cs="Times New Roman" w:eastAsia="Times New Roman"/>
-          <w:sz w:val="24"/>
-        </w:rPr>
-        <w:t xml:space="preserve">— som tar inn en yachts spesifikasjoner og en tenkt reise (land, måned, oppholdslengde, drivstoff</w:t>
-      </w:r>
-      <w:r>
-        <w:rPr>
-          <w:rFonts w:ascii="Times New Roman" w:hAnsi="Times New Roman" w:cs="Times New Roman" w:eastAsia="Times New Roman"/>
-          <w:sz w:val="24"/>
-        </w:rPr>
-        <w:softHyphen/>
-      </w:r>
-      <w:r>
-        <w:rPr>
-          <w:rFonts w:ascii="Times New Roman" w:hAnsi="Times New Roman" w:cs="Times New Roman" w:eastAsia="Times New Roman"/>
-          <w:sz w:val="24"/>
-        </w:rPr>
-        <w:t xml:space="preserve">nivå) og returnerer en totalpris fordelt på tjeneste</w:t>
-      </w:r>
-      <w:r>
-        <w:rPr>
-          <w:rFonts w:ascii="Times New Roman" w:hAnsi="Times New Roman" w:cs="Times New Roman" w:eastAsia="Times New Roman"/>
-          <w:sz w:val="24"/>
-        </w:rPr>
-        <w:softHyphen/>
-      </w:r>
-      <w:r>
-        <w:rPr>
-          <w:rFonts w:ascii="Times New Roman" w:hAnsi="Times New Roman" w:cs="Times New Roman" w:eastAsia="Times New Roman"/>
-          <w:sz w:val="24"/>
-        </w:rPr>
-        <w:t xml:space="preserve">kategori, sammen med et historisk kostnadsspenn (P25–P75) for konteksten anløpet hører til.</w:t>
-      </w:r>
-    </w:p>
-    <w:bookmarkStart w:id="11" w:name="problemstilling"/>
-    <w:p>
-      <w:pPr>
-        <w:pStyle w:val="Heading3"/>
-        <w:spacing w:line="360" w:lineRule="auto"/>
-      </w:pPr>
-      <w:r>
-        <w:rPr>
-          <w:rFonts w:ascii="Times New Roman" w:hAnsi="Times New Roman" w:cs="Times New Roman" w:eastAsia="Times New Roman"/>
-          <w:sz w:val="24"/>
-        </w:rPr>
-        <w:t xml:space="preserve">1.1 Problemstilling</w:t>
-      </w:r>
-    </w:p>
-    <w:p>
-      <w:pPr>
-        <w:pStyle w:val="BlockText"/>
-        <w:spacing w:line="360" w:lineRule="auto"/>
-      </w:pPr>
+        <w:t xml:space="preserve">agency manager</w:t>
+      </w:r>
+      <w:r>
+        <w:rPr>
+          <w:rFonts w:ascii="Times New Roman" w:hAnsi="Times New Roman" w:cs="Times New Roman" w:eastAsia="Times New Roman"/>
+          <w:sz w:val="24"/>
+        </w:rPr>
+        <w:t xml:space="preserve"> </w:t>
+      </w:r>
+      <w:r>
+        <w:rPr>
+          <w:rFonts w:ascii="Times New Roman" w:hAnsi="Times New Roman" w:cs="Times New Roman" w:eastAsia="Times New Roman"/>
+          <w:sz w:val="24"/>
+        </w:rPr>
+        <w:t xml:space="preserve">som tok seg tid til brukertesten i mai 2026 — funnene i § 9.5 hadde ikke vært mulige uten denne dialogen. Videre takk til foreleserne</w:t>
+      </w:r>
+      <w:r>
+        <w:rPr>
+          <w:rFonts w:ascii="Times New Roman" w:hAnsi="Times New Roman" w:cs="Times New Roman" w:eastAsia="Times New Roman"/>
+          <w:sz w:val="24"/>
+        </w:rPr>
+        <w:t xml:space="preserve"> </w:t>
+      </w:r>
       <w:r>
         <w:rPr>
           <w:rFonts w:ascii="Times New Roman" w:hAnsi="Times New Roman" w:cs="Times New Roman" w:eastAsia="Times New Roman"/>
@@ -809,6 +581,371 @@
           <w:bCs/>
           <w:sz w:val="24"/>
         </w:rPr>
+        <w:t xml:space="preserve">Bjørn-Inge Pettersen</w:t>
+      </w:r>
+      <w:r>
+        <w:rPr>
+          <w:rFonts w:ascii="Times New Roman" w:hAnsi="Times New Roman" w:cs="Times New Roman" w:eastAsia="Times New Roman"/>
+          <w:sz w:val="24"/>
+        </w:rPr>
+        <w:t xml:space="preserve"> </w:t>
+      </w:r>
+      <w:r>
+        <w:rPr>
+          <w:rFonts w:ascii="Times New Roman" w:hAnsi="Times New Roman" w:cs="Times New Roman" w:eastAsia="Times New Roman"/>
+          <w:sz w:val="24"/>
+        </w:rPr>
+        <w:t xml:space="preserve">og</w:t>
+      </w:r>
+      <w:r>
+        <w:rPr>
+          <w:rFonts w:ascii="Times New Roman" w:hAnsi="Times New Roman" w:cs="Times New Roman" w:eastAsia="Times New Roman"/>
+          <w:sz w:val="24"/>
+        </w:rPr>
+        <w:t xml:space="preserve"> </w:t>
+      </w:r>
+      <w:r>
+        <w:rPr>
+          <w:rFonts w:ascii="Times New Roman" w:hAnsi="Times New Roman" w:cs="Times New Roman" w:eastAsia="Times New Roman"/>
+          <w:b/>
+          <w:bCs/>
+          <w:sz w:val="24"/>
+        </w:rPr>
+        <w:t xml:space="preserve">Per Kristian Rekdal</w:t>
+      </w:r>
+      <w:r>
+        <w:rPr>
+          <w:rFonts w:ascii="Times New Roman" w:hAnsi="Times New Roman" w:cs="Times New Roman" w:eastAsia="Times New Roman"/>
+          <w:sz w:val="24"/>
+        </w:rPr>
+        <w:t xml:space="preserve"> </w:t>
+      </w:r>
+      <w:r>
+        <w:rPr>
+          <w:rFonts w:ascii="Times New Roman" w:hAnsi="Times New Roman" w:cs="Times New Roman" w:eastAsia="Times New Roman"/>
+          <w:sz w:val="24"/>
+        </w:rPr>
+        <w:t xml:space="preserve">for kompendiet</w:t>
+      </w:r>
+      <w:r>
+        <w:rPr>
+          <w:rFonts w:ascii="Times New Roman" w:hAnsi="Times New Roman" w:cs="Times New Roman" w:eastAsia="Times New Roman"/>
+          <w:sz w:val="24"/>
+        </w:rPr>
+        <w:t xml:space="preserve"> </w:t>
+      </w:r>
+      <w:r>
+        <w:rPr>
+          <w:rFonts w:ascii="Times New Roman" w:hAnsi="Times New Roman" w:cs="Times New Roman" w:eastAsia="Times New Roman"/>
+          <w:i/>
+          <w:iCs/>
+          <w:sz w:val="24"/>
+        </w:rPr>
+        <w:t xml:space="preserve">Kvantitative metoder i logistikk — implementert via KI</w:t>
+      </w:r>
+      <w:r>
+        <w:rPr>
+          <w:rFonts w:ascii="Times New Roman" w:hAnsi="Times New Roman" w:cs="Times New Roman" w:eastAsia="Times New Roman"/>
+          <w:sz w:val="24"/>
+        </w:rPr>
+        <w:t xml:space="preserve"> </w:t>
+      </w:r>
+      <w:r>
+        <w:rPr>
+          <w:rFonts w:ascii="Times New Roman" w:hAnsi="Times New Roman" w:cs="Times New Roman" w:eastAsia="Times New Roman"/>
+          <w:sz w:val="24"/>
+        </w:rPr>
+        <w:t xml:space="preserve">(2026) og for veiledning gjennom semesteret; metodevalget i NautiCost er direkte forankret i deres rammeverk (§ 2.2 og § 5.0). Takk også til medstudent i Gruppe 10 (Julie) for grundig peer-review 2026-05-07, hvis innspill er sporet og lukket i § 9.7.</w:t>
+      </w:r>
+    </w:p>
+    <w:p>
+      <w:pPr>
+        <w:pStyle w:val="BodyText"/>
+        <w:spacing w:line="360" w:lineRule="auto"/>
+      </w:pPr>
+      <w:r>
+        <w:rPr>
+          <w:rFonts w:ascii="Times New Roman" w:hAnsi="Times New Roman" w:cs="Times New Roman" w:eastAsia="Times New Roman"/>
+          <w:sz w:val="24"/>
+        </w:rPr>
+        <w:t xml:space="preserve">Til slutt en åpen merknad om AI-bruk: deler av koden, figurene og rapport</w:t>
+      </w:r>
+      <w:r>
+        <w:rPr>
+          <w:rFonts w:ascii="Times New Roman" w:hAnsi="Times New Roman" w:cs="Times New Roman" w:eastAsia="Times New Roman"/>
+          <w:sz w:val="24"/>
+        </w:rPr>
+        <w:softHyphen/>
+      </w:r>
+      <w:r>
+        <w:rPr>
+          <w:rFonts w:ascii="Times New Roman" w:hAnsi="Times New Roman" w:cs="Times New Roman" w:eastAsia="Times New Roman"/>
+          <w:sz w:val="24"/>
+        </w:rPr>
+        <w:t xml:space="preserve">teksten er utviklet i samarbeid med</w:t>
+      </w:r>
+      <w:r>
+        <w:rPr>
+          <w:rFonts w:ascii="Times New Roman" w:hAnsi="Times New Roman" w:cs="Times New Roman" w:eastAsia="Times New Roman"/>
+          <w:sz w:val="24"/>
+        </w:rPr>
+        <w:t xml:space="preserve"> </w:t>
+      </w:r>
+      <w:r>
+        <w:rPr>
+          <w:rFonts w:ascii="Times New Roman" w:hAnsi="Times New Roman" w:cs="Times New Roman" w:eastAsia="Times New Roman"/>
+          <w:b/>
+          <w:bCs/>
+          <w:sz w:val="24"/>
+        </w:rPr>
+        <w:t xml:space="preserve">Anthropic Claude</w:t>
+      </w:r>
+      <w:r>
+        <w:rPr>
+          <w:rFonts w:ascii="Times New Roman" w:hAnsi="Times New Roman" w:cs="Times New Roman" w:eastAsia="Times New Roman"/>
+          <w:sz w:val="24"/>
+        </w:rPr>
+        <w:t xml:space="preserve"> </w:t>
+      </w:r>
+      <w:r>
+        <w:rPr>
+          <w:rFonts w:ascii="Times New Roman" w:hAnsi="Times New Roman" w:cs="Times New Roman" w:eastAsia="Times New Roman"/>
+          <w:sz w:val="24"/>
+        </w:rPr>
+        <w:t xml:space="preserve">(Claude Code i terminal), i tråd med høgskolens retningslinjer om transparent KI-bruk. Alle resultat</w:t>
+      </w:r>
+      <w:r>
+        <w:rPr>
+          <w:rFonts w:ascii="Times New Roman" w:hAnsi="Times New Roman" w:cs="Times New Roman" w:eastAsia="Times New Roman"/>
+          <w:sz w:val="24"/>
+        </w:rPr>
+        <w:softHyphen/>
+      </w:r>
+      <w:r>
+        <w:rPr>
+          <w:rFonts w:ascii="Times New Roman" w:hAnsi="Times New Roman" w:cs="Times New Roman" w:eastAsia="Times New Roman"/>
+          <w:sz w:val="24"/>
+        </w:rPr>
+        <w:t xml:space="preserve">tall er likevel verifisert mot kildedata og reproduserbare via skriptene i</w:t>
+      </w:r>
+      <w:r>
+        <w:rPr>
+          <w:rFonts w:ascii="Times New Roman" w:hAnsi="Times New Roman" w:cs="Times New Roman" w:eastAsia="Times New Roman"/>
+          <w:sz w:val="24"/>
+        </w:rPr>
+        <w:t xml:space="preserve"> </w:t>
+      </w:r>
+      <w:r>
+        <w:rPr>
+          <w:rStyle w:val="VerbatimChar"/>
+          <w:rFonts w:ascii="Times New Roman" w:hAnsi="Times New Roman" w:cs="Times New Roman" w:eastAsia="Times New Roman"/>
+          <w:sz w:val="24"/>
+        </w:rPr>
+        <w:t xml:space="preserve">013 fase 3 - review/</w:t>
+      </w:r>
+      <w:r>
+        <w:rPr>
+          <w:rFonts w:ascii="Times New Roman" w:hAnsi="Times New Roman" w:cs="Times New Roman" w:eastAsia="Times New Roman"/>
+          <w:sz w:val="24"/>
+        </w:rPr>
+        <w:t xml:space="preserve">.</w:t>
+      </w:r>
+    </w:p>
+    <w:p>
+      <w:pPr>
+        <w:spacing w:line="360" w:lineRule="auto"/>
+      </w:pPr>
+      <w:r>
+        <w:rPr>
+          <w:rFonts w:ascii="Times New Roman" w:hAnsi="Times New Roman" w:cs="Times New Roman" w:eastAsia="Times New Roman"/>
+          <w:sz w:val="24"/>
+        </w:rPr>
+        <w:pict>
+          <v:rect style="width:0;height:1.5pt" o:hralign="center" o:hrstd="t" o:hr="t"/>
+        </w:pict>
+      </w:r>
+    </w:p>
+    <w:bookmarkEnd w:id="11"/>
+    <w:bookmarkStart w:id="17" w:name="innledning"/>
+    <w:p>
+      <w:pPr>
+        <w:pStyle w:val="Heading2"/>
+        <w:spacing w:line="360" w:lineRule="auto"/>
+      </w:pPr>
+      <w:r>
+        <w:rPr>
+          <w:rFonts w:ascii="Times New Roman" w:hAnsi="Times New Roman" w:cs="Times New Roman" w:eastAsia="Times New Roman"/>
+          <w:sz w:val="24"/>
+        </w:rPr>
+        <w:t xml:space="preserve">1. Innledning</w:t>
+      </w:r>
+    </w:p>
+    <w:p>
+      <w:pPr>
+        <w:pStyle w:val="FirstParagraph"/>
+        <w:spacing w:line="360" w:lineRule="auto"/>
+      </w:pPr>
+      <w:r>
+        <w:rPr>
+          <w:rFonts w:ascii="Times New Roman" w:hAnsi="Times New Roman" w:cs="Times New Roman" w:eastAsia="Times New Roman"/>
+          <w:sz w:val="24"/>
+        </w:rPr>
+        <w:t xml:space="preserve">Internasjonale superyachter genererer betydelige tjeneste</w:t>
+      </w:r>
+      <w:r>
+        <w:rPr>
+          <w:rFonts w:ascii="Times New Roman" w:hAnsi="Times New Roman" w:cs="Times New Roman" w:eastAsia="Times New Roman"/>
+          <w:sz w:val="24"/>
+        </w:rPr>
+        <w:softHyphen/>
+      </w:r>
+      <w:r>
+        <w:rPr>
+          <w:rFonts w:ascii="Times New Roman" w:hAnsi="Times New Roman" w:cs="Times New Roman" w:eastAsia="Times New Roman"/>
+          <w:sz w:val="24"/>
+        </w:rPr>
+        <w:t xml:space="preserve">inntekter for skandinaviske havneagenter, men kostnadsbildet ved et havneanløp er komplekst: ett anløp består typisk av 5–40 separate transaksjoner fordelt på havneavgift, los, hospitality, proviant, agenttjenester og bunkers. I dag estimeres totalkost</w:t>
+      </w:r>
+      <w:r>
+        <w:rPr>
+          <w:rFonts w:ascii="Times New Roman" w:hAnsi="Times New Roman" w:cs="Times New Roman" w:eastAsia="Times New Roman"/>
+          <w:sz w:val="24"/>
+        </w:rPr>
+        <w:softHyphen/>
+      </w:r>
+      <w:r>
+        <w:rPr>
+          <w:rFonts w:ascii="Times New Roman" w:hAnsi="Times New Roman" w:cs="Times New Roman" w:eastAsia="Times New Roman"/>
+          <w:sz w:val="24"/>
+        </w:rPr>
+        <w:t xml:space="preserve">naden manuelt av agent</w:t>
+      </w:r>
+      <w:r>
+        <w:rPr>
+          <w:rFonts w:ascii="Times New Roman" w:hAnsi="Times New Roman" w:cs="Times New Roman" w:eastAsia="Times New Roman"/>
+          <w:sz w:val="24"/>
+        </w:rPr>
+        <w:softHyphen/>
+      </w:r>
+      <w:r>
+        <w:rPr>
+          <w:rFonts w:ascii="Times New Roman" w:hAnsi="Times New Roman" w:cs="Times New Roman" w:eastAsia="Times New Roman"/>
+          <w:sz w:val="24"/>
+        </w:rPr>
+        <w:t xml:space="preserve">koordinator basert på erfaring og oppslag i tidligere fakturaer, hvilket er tidkrevende og inkonsistent. Resultatet er at yachteiere ofte mottar grove anslag som senere må justeres.</w:t>
+      </w:r>
+    </w:p>
+    <w:p>
+      <w:pPr>
+        <w:pStyle w:val="BodyText"/>
+        <w:spacing w:line="360" w:lineRule="auto"/>
+      </w:pPr>
+      <w:r>
+        <w:rPr>
+          <w:rFonts w:ascii="Times New Roman" w:hAnsi="Times New Roman" w:cs="Times New Roman" w:eastAsia="Times New Roman"/>
+          <w:sz w:val="24"/>
+        </w:rPr>
+        <w:t xml:space="preserve">Dette prosjektet utvikler et datadrevet estimerings</w:t>
+      </w:r>
+      <w:r>
+        <w:rPr>
+          <w:rFonts w:ascii="Times New Roman" w:hAnsi="Times New Roman" w:cs="Times New Roman" w:eastAsia="Times New Roman"/>
+          <w:sz w:val="24"/>
+        </w:rPr>
+        <w:softHyphen/>
+      </w:r>
+      <w:r>
+        <w:rPr>
+          <w:rFonts w:ascii="Times New Roman" w:hAnsi="Times New Roman" w:cs="Times New Roman" w:eastAsia="Times New Roman"/>
+          <w:sz w:val="24"/>
+        </w:rPr>
+        <w:t xml:space="preserve">verktøy —</w:t>
+      </w:r>
+      <w:r>
+        <w:rPr>
+          <w:rFonts w:ascii="Times New Roman" w:hAnsi="Times New Roman" w:cs="Times New Roman" w:eastAsia="Times New Roman"/>
+          <w:sz w:val="24"/>
+        </w:rPr>
+        <w:t xml:space="preserve"> </w:t>
+      </w:r>
+      <w:r>
+        <w:rPr>
+          <w:rFonts w:ascii="Times New Roman" w:hAnsi="Times New Roman" w:cs="Times New Roman" w:eastAsia="Times New Roman"/>
+          <w:i/>
+          <w:iCs/>
+          <w:sz w:val="24"/>
+        </w:rPr>
+        <w:t xml:space="preserve">NautiCost</w:t>
+      </w:r>
+      <w:r>
+        <w:rPr>
+          <w:rFonts w:ascii="Times New Roman" w:hAnsi="Times New Roman" w:cs="Times New Roman" w:eastAsia="Times New Roman"/>
+          <w:sz w:val="24"/>
+        </w:rPr>
+        <w:t xml:space="preserve"> </w:t>
+      </w:r>
+      <w:r>
+        <w:rPr>
+          <w:rFonts w:ascii="Times New Roman" w:hAnsi="Times New Roman" w:cs="Times New Roman" w:eastAsia="Times New Roman"/>
+          <w:sz w:val="24"/>
+        </w:rPr>
+        <w:t xml:space="preserve">— som tar inn en yachts spesifikasjoner og en tenkt reise (land, måned, oppholdslengde, drivstoff</w:t>
+      </w:r>
+      <w:r>
+        <w:rPr>
+          <w:rFonts w:ascii="Times New Roman" w:hAnsi="Times New Roman" w:cs="Times New Roman" w:eastAsia="Times New Roman"/>
+          <w:sz w:val="24"/>
+        </w:rPr>
+        <w:softHyphen/>
+      </w:r>
+      <w:r>
+        <w:rPr>
+          <w:rFonts w:ascii="Times New Roman" w:hAnsi="Times New Roman" w:cs="Times New Roman" w:eastAsia="Times New Roman"/>
+          <w:sz w:val="24"/>
+        </w:rPr>
+        <w:t xml:space="preserve">nivå) og returnerer en totalpris fordelt på tjeneste</w:t>
+      </w:r>
+      <w:r>
+        <w:rPr>
+          <w:rFonts w:ascii="Times New Roman" w:hAnsi="Times New Roman" w:cs="Times New Roman" w:eastAsia="Times New Roman"/>
+          <w:sz w:val="24"/>
+        </w:rPr>
+        <w:softHyphen/>
+      </w:r>
+      <w:r>
+        <w:rPr>
+          <w:rFonts w:ascii="Times New Roman" w:hAnsi="Times New Roman" w:cs="Times New Roman" w:eastAsia="Times New Roman"/>
+          <w:sz w:val="24"/>
+        </w:rPr>
+        <w:t xml:space="preserve">kategori, sammen med et historisk kostnadsspenn (P25–P75) for konteksten anløpet hører til.</w:t>
+      </w:r>
+    </w:p>
+    <w:bookmarkStart w:id="12" w:name="problemstilling"/>
+    <w:p>
+      <w:pPr>
+        <w:pStyle w:val="Heading3"/>
+        <w:spacing w:line="360" w:lineRule="auto"/>
+      </w:pPr>
+      <w:r>
+        <w:rPr>
+          <w:rFonts w:ascii="Times New Roman" w:hAnsi="Times New Roman" w:cs="Times New Roman" w:eastAsia="Times New Roman"/>
+          <w:sz w:val="24"/>
+        </w:rPr>
+        <w:t xml:space="preserve">1.1 Problemstilling</w:t>
+      </w:r>
+    </w:p>
+    <w:p>
+      <w:pPr>
+        <w:pStyle w:val="BlockText"/>
+        <w:spacing w:line="360" w:lineRule="auto"/>
+      </w:pPr>
+      <w:r>
+        <w:rPr>
+          <w:rFonts w:ascii="Times New Roman" w:hAnsi="Times New Roman" w:cs="Times New Roman" w:eastAsia="Times New Roman"/>
+          <w:b/>
+          <w:bCs/>
+          <w:sz w:val="24"/>
+        </w:rPr>
         <w:t xml:space="preserve">Hovedspørsmål:</w:t>
       </w:r>
       <w:r>
@@ -882,8 +1019,8 @@
         <w:t xml:space="preserve">data?</w:t>
       </w:r>
     </w:p>
-    <w:bookmarkEnd w:id="11"/>
-    <w:bookmarkStart w:id="12" w:name="delproblemer"/>
+    <w:bookmarkEnd w:id="12"/>
+    <w:bookmarkStart w:id="13" w:name="delproblemer"/>
     <w:p>
       <w:pPr>
         <w:pStyle w:val="Heading3"/>
@@ -1188,8 +1325,8 @@
         <w:t xml:space="preserve">gjengelig web-tjeneste som svarer innen to sekunder?</w:t>
       </w:r>
     </w:p>
-    <w:bookmarkEnd w:id="12"/>
-    <w:bookmarkStart w:id="13" w:name="avgrensninger"/>
+    <w:bookmarkEnd w:id="13"/>
+    <w:bookmarkStart w:id="14" w:name="avgrensninger"/>
     <w:p>
       <w:pPr>
         <w:pStyle w:val="Heading3"/>
@@ -1585,8 +1722,8 @@
         <w:t xml:space="preserve">vilkår er ikke en del av leveransen.</w:t>
       </w:r>
     </w:p>
-    <w:bookmarkEnd w:id="13"/>
-    <w:bookmarkStart w:id="14" w:name="antakelser"/>
+    <w:bookmarkEnd w:id="14"/>
+    <w:bookmarkStart w:id="15" w:name="antakelser"/>
     <w:p>
       <w:pPr>
         <w:pStyle w:val="Heading3"/>
@@ -1840,8 +1977,8 @@
         <w:t xml:space="preserve">En log-transformasjon på kostnaden gir en tilstrekkelig symmetrisk feilfordeling til at MAE/RMSE-baserte modeller fungerer godt.</w:t>
       </w:r>
     </w:p>
-    <w:bookmarkEnd w:id="14"/>
-    <w:bookmarkStart w:id="15" w:name="akademisk-bidrag"/>
+    <w:bookmarkEnd w:id="15"/>
+    <w:bookmarkStart w:id="16" w:name="akademisk-bidrag"/>
     <w:p>
       <w:pPr>
         <w:pStyle w:val="Heading3"/>
@@ -2196,9 +2333,9 @@
         </w:pict>
       </w:r>
     </w:p>
-    <w:bookmarkEnd w:id="15"/>
     <w:bookmarkEnd w:id="16"/>
-    <w:bookmarkStart w:id="21" w:name="litteratur"/>
+    <w:bookmarkEnd w:id="17"/>
+    <w:bookmarkStart w:id="22" w:name="litteratur"/>
     <w:p>
       <w:pPr>
         <w:pStyle w:val="Heading2"/>
@@ -2225,7 +2362,7 @@
         <w:t xml:space="preserve">Denne litteraturgjennomgangen dekker tre tråder som er sentrale for NautiCost: (1) maskinlæring for kostnads- og rateprognoser i maritim logistikk, (2) gradient boosting på tabulære data, og (3) usikkerhetskvantifisering med kvantilregresjon og konform prediksjon.</w:t>
       </w:r>
     </w:p>
-    <w:bookmarkStart w:id="17" w:name="X7c64d5c69e8be4aa342d1f5b50a96f4760fe6ea"/>
+    <w:bookmarkStart w:id="18" w:name="X7c64d5c69e8be4aa342d1f5b50a96f4760fe6ea"/>
     <w:p>
       <w:pPr>
         <w:pStyle w:val="Heading3"/>
@@ -2308,8 +2445,8 @@
         <w:t xml:space="preserve">— hver enkeltfaktura predikeres separat, og aggregeres deretter til anløpsnivå via portmaler og trafikkvekter. En slik tilnærming gir finere oppløsning enn aggregert prediksjon og kan i prinsippet returnere en kostnadsfordeling per tjenestekategori; hvor godt dette fungerer empirisk vurderes i § 8.</w:t>
       </w:r>
     </w:p>
-    <w:bookmarkEnd w:id="17"/>
-    <w:bookmarkStart w:id="18" w:name="X50f1a326dd81dd1da535bd6543ea8d29f23ade9"/>
+    <w:bookmarkEnd w:id="18"/>
+    <w:bookmarkStart w:id="19" w:name="X50f1a326dd81dd1da535bd6543ea8d29f23ade9"/>
     <w:p>
       <w:pPr>
         <w:pStyle w:val="Heading3"/>
@@ -2503,8 +2640,8 @@
         <w:t xml:space="preserve">bånd.</w:t>
       </w:r>
     </w:p>
-    <w:bookmarkEnd w:id="18"/>
-    <w:bookmarkStart w:id="19" w:name="X52ccaa96010e029cb7ad8233c60e45490ae75db"/>
+    <w:bookmarkEnd w:id="19"/>
+    <w:bookmarkStart w:id="20" w:name="X52ccaa96010e029cb7ad8233c60e45490ae75db"/>
     <w:p>
       <w:pPr>
         <w:pStyle w:val="Heading3"/>
@@ -2601,8 +2738,8 @@
         <w:t xml:space="preserve">For forklarbarhet bruker NautiCost SHAP-verdier (Lundberg &amp; Lee, 2017), som dekomponerer enkeltprediksjoner i per-feature-bidrag basert på Shapley-verdier fra kooperativ spillteori. TreeSHAP-algoritmen (Lundberg et al., 2020) muliggjør eksakt, effektiv beregning for treensembler og gir både globale feature-importance-rangeringer og lokale per-prediksjon-forklaringer (jf. § 3.6 og § 7.3).</w:t>
       </w:r>
     </w:p>
-    <w:bookmarkEnd w:id="19"/>
-    <w:bookmarkStart w:id="20" w:name="forskningsgap"/>
+    <w:bookmarkEnd w:id="20"/>
+    <w:bookmarkStart w:id="21" w:name="forskningsgap"/>
     <w:p>
       <w:pPr>
         <w:pStyle w:val="Heading3"/>
@@ -2803,9 +2940,9 @@
         </w:pict>
       </w:r>
     </w:p>
-    <w:bookmarkEnd w:id="20"/>
     <w:bookmarkEnd w:id="21"/>
-    <w:bookmarkStart w:id="28" w:name="teori"/>
+    <w:bookmarkEnd w:id="22"/>
+    <w:bookmarkStart w:id="29" w:name="teori"/>
     <w:p>
       <w:pPr>
         <w:pStyle w:val="Heading2"/>
@@ -2846,7 +2983,7 @@
         <w:t xml:space="preserve">beskrivelse, men en begrunnelse for de metodevalgene som tas i § 5 og § 6.</w:t>
       </w:r>
     </w:p>
-    <w:bookmarkStart w:id="22" w:name="tabulær-læring-og-gradient-boosting"/>
+    <w:bookmarkStart w:id="23" w:name="tabulær-læring-og-gradient-boosting"/>
     <w:p>
       <w:pPr>
         <w:pStyle w:val="Heading3"/>
@@ -3913,8 +4050,8 @@
         <w:t xml:space="preserve">DP2 spør hvilken modell som gir lavest prognosefeil på heterogene tabulære data. Gradient boosting dominerer denne typen data (Grinsztajn et al., 2022; Shwartz-Ziv &amp; Armon, 2022), og er utgangspunktet for § 6.</w:t>
       </w:r>
     </w:p>
-    <w:bookmarkEnd w:id="22"/>
-    <w:bookmarkStart w:id="23" w:name="lightgbm"/>
+    <w:bookmarkEnd w:id="23"/>
+    <w:bookmarkStart w:id="24" w:name="lightgbm"/>
     <w:p>
       <w:pPr>
         <w:pStyle w:val="Heading3"/>
@@ -4577,8 +4714,8 @@
         <w:t xml:space="preserve">LightGBM håndterer blandet input og lav rad-til-feature-ratio (63) effektivt — derav valget i § 6.3.</w:t>
       </w:r>
     </w:p>
-    <w:bookmarkEnd w:id="23"/>
-    <w:bookmarkStart w:id="24" w:name="catboost"/>
+    <w:bookmarkEnd w:id="24"/>
+    <w:bookmarkStart w:id="25" w:name="catboost"/>
     <w:p>
       <w:pPr>
         <w:pStyle w:val="Heading3"/>
@@ -5353,8 +5490,8 @@
         <w:t xml:space="preserve">CatBoosts uavhengige induktive bias (symmetriske trær, ordered encoding) dekorrelerer feil mot LightGBM og gir ensemble-arkitekturen i § 6.3 mer robusthet ved drift.</w:t>
       </w:r>
     </w:p>
-    <w:bookmarkEnd w:id="24"/>
-    <w:bookmarkStart w:id="25" w:name="log-transformert-mål-og-evaluering"/>
+    <w:bookmarkEnd w:id="25"/>
+    <w:bookmarkStart w:id="26" w:name="log-transformert-mål-og-evaluering"/>
     <w:p>
       <w:pPr>
         <w:pStyle w:val="Heading3"/>
@@ -6559,8 +6696,8 @@
         <w:t xml:space="preserve">Log-MSE-tap og MAE som primær metrikk er direkte konsekvenser av kostnadsfordelingens skjevhet (§ 7.1).</w:t>
       </w:r>
     </w:p>
-    <w:bookmarkEnd w:id="25"/>
-    <w:bookmarkStart w:id="26" w:name="kvantilregresjon-og-konform-prediksjon"/>
+    <w:bookmarkEnd w:id="26"/>
+    <w:bookmarkStart w:id="27" w:name="kvantilregresjon-og-konform-prediksjon"/>
     <w:p>
       <w:pPr>
         <w:pStyle w:val="Heading3"/>
@@ -8583,8 +8720,8 @@
         <w:t xml:space="preserve">et (DP4), og CQR garanterer kalibrert dekning på små datasett.</w:t>
       </w:r>
     </w:p>
-    <w:bookmarkEnd w:id="26"/>
-    <w:bookmarkStart w:id="27" w:name="shap-verdier"/>
+    <w:bookmarkEnd w:id="27"/>
+    <w:bookmarkStart w:id="28" w:name="shap-verdier"/>
     <w:p>
       <w:pPr>
         <w:pStyle w:val="Heading3"/>
@@ -9721,9 +9858,9 @@
         </w:pict>
       </w:r>
     </w:p>
-    <w:bookmarkEnd w:id="27"/>
     <w:bookmarkEnd w:id="28"/>
-    <w:bookmarkStart w:id="29" w:name="casebeskrivelse"/>
+    <w:bookmarkEnd w:id="29"/>
+    <w:bookmarkStart w:id="30" w:name="casebeskrivelse"/>
     <w:p>
       <w:pPr>
         <w:pStyle w:val="Heading2"/>
@@ -10410,8 +10547,8 @@
         </w:pict>
       </w:r>
     </w:p>
-    <w:bookmarkEnd w:id="29"/>
-    <w:bookmarkStart w:id="38" w:name="metode-og-data"/>
+    <w:bookmarkEnd w:id="30"/>
+    <w:bookmarkStart w:id="39" w:name="metode-og-data"/>
     <w:p>
       <w:pPr>
         <w:pStyle w:val="Heading2"/>
@@ -10425,7 +10562,7 @@
         <w:t xml:space="preserve">5. Metode og data</w:t>
       </w:r>
     </w:p>
-    <w:bookmarkStart w:id="30" w:name="prosessmapping-mot-pensumkompendiet"/>
+    <w:bookmarkStart w:id="31" w:name="prosessmapping-mot-pensumkompendiet"/>
     <w:p>
       <w:pPr>
         <w:pStyle w:val="Heading3"/>
@@ -10852,8 +10989,8 @@
         <w:t xml:space="preserve">kompendiet kan navigere rapporten med kjent rammeverk, og at de fem trinnene er dekket før vi konkluderer i § 10.</w:t>
       </w:r>
     </w:p>
-    <w:bookmarkEnd w:id="30"/>
-    <w:bookmarkStart w:id="31" w:name="forskningsdesign"/>
+    <w:bookmarkEnd w:id="31"/>
+    <w:bookmarkStart w:id="32" w:name="forskningsdesign"/>
     <w:p>
       <w:pPr>
         <w:pStyle w:val="Heading3"/>
@@ -10922,8 +11059,8 @@
         <w:t xml:space="preserve">lekkasje, og evaluerer modellen mot operasjonelt relevante feilmetrikker (MAE i EUR — kildedataenes egen valuta, jf. § 1.3 — samt P25–P75-dekning).</w:t>
       </w:r>
     </w:p>
-    <w:bookmarkEnd w:id="31"/>
-    <w:bookmarkStart w:id="32" w:name="datakilder"/>
+    <w:bookmarkEnd w:id="32"/>
+    <w:bookmarkStart w:id="33" w:name="datakilder"/>
     <w:p>
       <w:pPr>
         <w:pStyle w:val="Heading3"/>
@@ -11430,8 +11567,8 @@
         </w:tc>
       </w:tr>
     </w:tbl>
-    <w:bookmarkEnd w:id="32"/>
-    <w:bookmarkStart w:id="33" w:name="datapreparering"/>
+    <w:bookmarkEnd w:id="33"/>
+    <w:bookmarkStart w:id="34" w:name="datapreparering"/>
     <w:p>
       <w:pPr>
         <w:pStyle w:val="Heading3"/>
@@ -11815,8 +11952,8 @@
         <w:t xml:space="preserve">fjernes (jf. antakelse A3).</w:t>
       </w:r>
     </w:p>
-    <w:bookmarkEnd w:id="33"/>
-    <w:bookmarkStart w:id="34" w:name="datasplit-og-evalueringsprotokoll"/>
+    <w:bookmarkEnd w:id="34"/>
+    <w:bookmarkStart w:id="35" w:name="datasplit-og-evalueringsprotokoll"/>
     <w:p>
       <w:pPr>
         <w:pStyle w:val="Heading3"/>
@@ -12583,8 +12720,8 @@
         <w:t xml:space="preserve">vindu (2026+) gir tilstrekkelig data. Dette diskuteres som begrensning i § 10.</w:t>
       </w:r>
     </w:p>
-    <w:bookmarkEnd w:id="34"/>
-    <w:bookmarkStart w:id="35" w:name="feature-engineering"/>
+    <w:bookmarkEnd w:id="35"/>
+    <w:bookmarkStart w:id="36" w:name="feature-engineering"/>
     <w:p>
       <w:pPr>
         <w:pStyle w:val="Heading3"/>
@@ -13640,8 +13777,8 @@
         <w:t xml:space="preserve">).</w:t>
       </w:r>
     </w:p>
-    <w:bookmarkEnd w:id="35"/>
-    <w:bookmarkStart w:id="36" w:name="verktøy-og-reproduserbarhet"/>
+    <w:bookmarkEnd w:id="36"/>
+    <w:bookmarkStart w:id="37" w:name="verktøy-og-reproduserbarhet"/>
     <w:p>
       <w:pPr>
         <w:pStyle w:val="Heading3"/>
@@ -13760,8 +13897,8 @@
         <w:t xml:space="preserve">kontrollert på GitHub i samsvar med god vitenskapelig praksis.</w:t>
       </w:r>
     </w:p>
-    <w:bookmarkEnd w:id="36"/>
-    <w:bookmarkStart w:id="37" w:name="antakelsessjekk-kompendiet-steg-2"/>
+    <w:bookmarkEnd w:id="37"/>
+    <w:bookmarkStart w:id="38" w:name="antakelsessjekk-kompendiet-steg-2"/>
     <w:p>
       <w:pPr>
         <w:pStyle w:val="Heading3"/>
@@ -14421,9 +14558,9 @@
         </w:pict>
       </w:r>
     </w:p>
-    <w:bookmarkEnd w:id="37"/>
     <w:bookmarkEnd w:id="38"/>
-    <w:bookmarkStart w:id="44" w:name="modell"/>
+    <w:bookmarkEnd w:id="39"/>
+    <w:bookmarkStart w:id="45" w:name="modell"/>
     <w:p>
       <w:pPr>
         <w:pStyle w:val="Heading2"/>
@@ -14437,7 +14574,7 @@
         <w:t xml:space="preserve">6. Modell</w:t>
       </w:r>
     </w:p>
-    <w:bookmarkStart w:id="39" w:name="målvariabel-og-tap"/>
+    <w:bookmarkStart w:id="40" w:name="målvariabel-og-tap"/>
     <w:p>
       <w:pPr>
         <w:pStyle w:val="Heading3"/>
@@ -14612,8 +14749,8 @@
         <w:t xml:space="preserve">ved evaluering.</w:t>
       </w:r>
     </w:p>
-    <w:bookmarkEnd w:id="39"/>
-    <w:bookmarkStart w:id="40" w:name="baselinemodeller"/>
+    <w:bookmarkEnd w:id="40"/>
+    <w:bookmarkStart w:id="41" w:name="baselinemodeller"/>
     <w:p>
       <w:pPr>
         <w:pStyle w:val="Heading3"/>
@@ -14814,8 +14951,8 @@
         <w:t xml:space="preserve">lineær modell med one-hot-kodede kategorier og standardiserte numeriske features.</w:t>
       </w:r>
     </w:p>
-    <w:bookmarkEnd w:id="40"/>
-    <w:bookmarkStart w:id="41" w:name="hovedmodell-lightgbm-catboost-ensemble"/>
+    <w:bookmarkEnd w:id="41"/>
+    <w:bookmarkStart w:id="42" w:name="hovedmodell-lightgbm-catboost-ensemble"/>
     <w:p>
       <w:pPr>
         <w:pStyle w:val="Heading3"/>
@@ -15229,8 +15366,8 @@
         <w:t xml:space="preserve">før produksjon.</w:t>
       </w:r>
     </w:p>
-    <w:bookmarkEnd w:id="41"/>
-    <w:bookmarkStart w:id="42" w:name="kvantilmodell-og-konform-kalibrering"/>
+    <w:bookmarkEnd w:id="42"/>
+    <w:bookmarkStart w:id="43" w:name="kvantilmodell-og-konform-kalibrering"/>
     <w:p>
       <w:pPr>
         <w:pStyle w:val="Heading3"/>
@@ -15387,8 +15524,8 @@
         <w:t xml:space="preserve">observert drøftes i § 9.2.</w:t>
       </w:r>
     </w:p>
-    <w:bookmarkEnd w:id="42"/>
-    <w:bookmarkStart w:id="43" w:name="hybrid-kalibrering-på-anløpsnivå"/>
+    <w:bookmarkEnd w:id="43"/>
+    <w:bookmarkStart w:id="44" w:name="hybrid-kalibrering-på-anløpsnivå"/>
     <w:p>
       <w:pPr>
         <w:pStyle w:val="Heading3"/>
@@ -15876,9 +16013,9 @@
         </w:pict>
       </w:r>
     </w:p>
-    <w:bookmarkEnd w:id="43"/>
     <w:bookmarkEnd w:id="44"/>
-    <w:bookmarkStart w:id="73" w:name="analyse"/>
+    <w:bookmarkEnd w:id="45"/>
+    <w:bookmarkStart w:id="74" w:name="analyse"/>
     <w:p>
       <w:pPr>
         <w:pStyle w:val="Heading2"/>
@@ -16014,7 +16151,7 @@
         <w:t xml:space="preserve">. Figurtekstene under er bevisst skrevet stand-alone — alle nøkkeltall som diskusjonen senere bygger på, gjengis i teksten her, slik at rapporten kan leses uten å åpne notebookene.</w:t>
       </w:r>
     </w:p>
-    <w:bookmarkStart w:id="54" w:name="beskrivende-statistikk"/>
+    <w:bookmarkStart w:id="55" w:name="beskrivende-statistikk"/>
     <w:p>
       <w:pPr>
         <w:pStyle w:val="Heading3"/>
@@ -16042,18 +16179,18 @@
           <wp:inline>
             <wp:extent cx="5334000" cy="3288699"/>
             <wp:effectExtent b="0" l="0" r="0" t="0"/>
-            <wp:docPr descr="Figur 7.1: Distribusjon av final_charge (log-skala) — høyreskjev kostnadsfordeling som motiverer log-transformasjonen i § 6.1" title="" id="46" name="Picture"/>
+            <wp:docPr descr="Figur 7.1: Distribusjon av final_charge (log-skala) — høyreskjev kostnadsfordeling som motiverer log-transformasjonen i § 6.1" title="" id="47" name="Picture"/>
             <a:graphic>
               <a:graphicData uri="http://schemas.openxmlformats.org/drawingml/2006/picture">
                 <pic:pic>
                   <pic:nvPicPr>
-                    <pic:cNvPr descr="figures/figur_7_1_kostnadsfordeling.png" id="47" name="Picture"/>
+                    <pic:cNvPr descr="figures/figur_7_1_kostnadsfordeling.png" id="48" name="Picture"/>
                     <pic:cNvPicPr>
                       <a:picLocks noChangeArrowheads="1" noChangeAspect="1"/>
                     </pic:cNvPicPr>
                   </pic:nvPicPr>
                   <pic:blipFill>
-                    <a:blip r:embed="rId45"/>
+                    <a:blip r:embed="rId46"/>
                     <a:stretch>
                       <a:fillRect/>
                     </a:stretch>
@@ -16294,18 +16431,18 @@
           <wp:inline>
             <wp:extent cx="5334000" cy="2389866"/>
             <wp:effectExtent b="0" l="0" r="0" t="0"/>
-            <wp:docPr descr="Figur 7.2: Antall transaksjoner per havn og år (2020–2025) — viser trafikkvolum og datatilfang per havn" title="" id="49" name="Picture"/>
+            <wp:docPr descr="Figur 7.2: Antall transaksjoner per havn og år (2020–2025) — viser trafikkvolum og datatilfang per havn" title="" id="50" name="Picture"/>
             <a:graphic>
               <a:graphicData uri="http://schemas.openxmlformats.org/drawingml/2006/picture">
                 <pic:pic>
                   <pic:nvPicPr>
-                    <pic:cNvPr descr="figures/figur_7_2_havn_per_aar.png" id="50" name="Picture"/>
+                    <pic:cNvPr descr="figures/figur_7_2_havn_per_aar.png" id="51" name="Picture"/>
                     <pic:cNvPicPr>
                       <a:picLocks noChangeArrowheads="1" noChangeAspect="1"/>
                     </pic:cNvPicPr>
                   </pic:nvPicPr>
                   <pic:blipFill>
-                    <a:blip r:embed="rId48"/>
+                    <a:blip r:embed="rId49"/>
                     <a:stretch>
                       <a:fillRect/>
                     </a:stretch>
@@ -16476,18 +16613,18 @@
           <wp:inline>
             <wp:extent cx="5334000" cy="2634650"/>
             <wp:effectExtent b="0" l="0" r="0" t="0"/>
-            <wp:docPr descr="Figur 7.3: Kostnad per tjenestekategori, fordelt på størrelseskategori (Liten / Mellomstor / Stor)" title="" id="52" name="Picture"/>
+            <wp:docPr descr="Figur 7.3: Kostnad per tjenestekategori, fordelt på størrelseskategori (Liten / Mellomstor / Stor)" title="" id="53" name="Picture"/>
             <a:graphic>
               <a:graphicData uri="http://schemas.openxmlformats.org/drawingml/2006/picture">
                 <pic:pic>
                   <pic:nvPicPr>
-                    <pic:cNvPr descr="figures/figur_7_3_tjeneste_x_storrelse.png" id="53" name="Picture"/>
+                    <pic:cNvPr descr="figures/figur_7_3_tjeneste_x_storrelse.png" id="54" name="Picture"/>
                     <pic:cNvPicPr>
                       <a:picLocks noChangeArrowheads="1" noChangeAspect="1"/>
                     </pic:cNvPicPr>
                   </pic:nvPicPr>
                   <pic:blipFill>
-                    <a:blip r:embed="rId51"/>
+                    <a:blip r:embed="rId52"/>
                     <a:stretch>
                       <a:fillRect/>
                     </a:stretch>
@@ -16642,8 +16779,8 @@
         <w:t xml:space="preserve">, seksjon 3.3.)</w:t>
       </w:r>
     </w:p>
-    <w:bookmarkEnd w:id="54"/>
-    <w:bookmarkStart w:id="61" w:name="korrelasjoner-og-feature-importance"/>
+    <w:bookmarkEnd w:id="55"/>
+    <w:bookmarkStart w:id="62" w:name="korrelasjoner-og-feature-importance"/>
     <w:p>
       <w:pPr>
         <w:pStyle w:val="Heading3"/>
@@ -16671,18 +16808,18 @@
           <wp:inline>
             <wp:extent cx="5334000" cy="3294926"/>
             <wp:effectExtent b="0" l="0" r="0" t="0"/>
-            <wp:docPr descr="Figur 7.4: Spearman-korrelasjon mellom numeriske features og log-kostnad — GT, LOA og fuel­konsum er moderat positivt korrelert" title="" id="56" name="Picture"/>
+            <wp:docPr descr="Figur 7.4: Spearman-korrelasjon mellom numeriske features og log-kostnad — GT, LOA og fuel­konsum er moderat positivt korrelert" title="" id="57" name="Picture"/>
             <a:graphic>
               <a:graphicData uri="http://schemas.openxmlformats.org/drawingml/2006/picture">
                 <pic:pic>
                   <pic:nvPicPr>
-                    <pic:cNvPr descr="figures/figur_7_4_spearman.png" id="57" name="Picture"/>
+                    <pic:cNvPr descr="figures/figur_7_4_spearman.png" id="58" name="Picture"/>
                     <pic:cNvPicPr>
                       <a:picLocks noChangeArrowheads="1" noChangeAspect="1"/>
                     </pic:cNvPicPr>
                   </pic:nvPicPr>
                   <pic:blipFill>
-                    <a:blip r:embed="rId55"/>
+                    <a:blip r:embed="rId56"/>
                     <a:stretch>
                       <a:fillRect/>
                     </a:stretch>
@@ -16851,18 +16988,18 @@
           <wp:inline>
             <wp:extent cx="5334000" cy="3528031"/>
             <wp:effectExtent b="0" l="0" r="0" t="0"/>
-            <wp:docPr descr="Figur 7.5: Top-15 feature importance fra LightGBM (gain-andel) — service_type og størrelse-baserte aggregat­statistikker dominerer" title="" id="59" name="Picture"/>
+            <wp:docPr descr="Figur 7.5: Top-15 feature importance fra LightGBM (gain-andel) — service_type og størrelse-baserte aggregat­statistikker dominerer" title="" id="60" name="Picture"/>
             <a:graphic>
               <a:graphicData uri="http://schemas.openxmlformats.org/drawingml/2006/picture">
                 <pic:pic>
                   <pic:nvPicPr>
-                    <pic:cNvPr descr="figures/figur_7_5_feature_importance.png" id="60" name="Picture"/>
+                    <pic:cNvPr descr="figures/figur_7_5_feature_importance.png" id="61" name="Picture"/>
                     <pic:cNvPicPr>
                       <a:picLocks noChangeArrowheads="1" noChangeAspect="1"/>
                     </pic:cNvPicPr>
                   </pic:nvPicPr>
                   <pic:blipFill>
-                    <a:blip r:embed="rId58"/>
+                    <a:blip r:embed="rId59"/>
                     <a:stretch>
                       <a:fillRect/>
                     </a:stretch>
@@ -17205,8 +17342,8 @@
         <w:t xml:space="preserve">.)</w:t>
       </w:r>
     </w:p>
-    <w:bookmarkEnd w:id="61"/>
-    <w:bookmarkStart w:id="68" w:name="shap-analyse"/>
+    <w:bookmarkEnd w:id="62"/>
+    <w:bookmarkStart w:id="69" w:name="shap-analyse"/>
     <w:p>
       <w:pPr>
         <w:pStyle w:val="Heading3"/>
@@ -17234,18 +17371,18 @@
           <wp:inline>
             <wp:extent cx="5334000" cy="3530676"/>
             <wp:effectExtent b="0" l="0" r="0" t="0"/>
-            <wp:docPr descr="Figur 7.6: SHAP summary plot — effekt­retning og styrke per feature i ensemble­modellen" title="" id="63" name="Picture"/>
+            <wp:docPr descr="Figur 7.6: LightGBM gain-importance (fallback for SHAP, jf. § 9.7) — relativ styrke per feature i ensemble­modellen" title="" id="64" name="Picture"/>
             <a:graphic>
               <a:graphicData uri="http://schemas.openxmlformats.org/drawingml/2006/picture">
                 <pic:pic>
                   <pic:nvPicPr>
-                    <pic:cNvPr descr="figures/figur_7_6_shap_summary.png" id="64" name="Picture"/>
+                    <pic:cNvPr descr="figures/figur_7_6_shap_summary.png" id="65" name="Picture"/>
                     <pic:cNvPicPr>
                       <a:picLocks noChangeArrowheads="1" noChangeAspect="1"/>
                     </pic:cNvPicPr>
                   </pic:nvPicPr>
                   <pic:blipFill>
-                    <a:blip r:embed="rId62"/>
+                    <a:blip r:embed="rId63"/>
                     <a:stretch>
                       <a:fillRect/>
                     </a:stretch>
@@ -17282,21 +17419,7 @@
           <w:rFonts w:ascii="Times New Roman" w:hAnsi="Times New Roman" w:cs="Times New Roman" w:eastAsia="Times New Roman"/>
           <w:sz w:val="24"/>
         </w:rPr>
-        <w:t xml:space="preserve">Figur 7.6: SHAP summary plot — effekt</w:t>
-      </w:r>
-      <w:r>
-        <w:rPr>
-          <w:rFonts w:ascii="Times New Roman" w:hAnsi="Times New Roman" w:cs="Times New Roman" w:eastAsia="Times New Roman"/>
-          <w:sz w:val="24"/>
-        </w:rPr>
-        <w:softHyphen/>
-      </w:r>
-      <w:r>
-        <w:rPr>
-          <w:rFonts w:ascii="Times New Roman" w:hAnsi="Times New Roman" w:cs="Times New Roman" w:eastAsia="Times New Roman"/>
-          <w:sz w:val="24"/>
-        </w:rPr>
-        <w:t xml:space="preserve">retning og styrke per feature i ensemble</w:t>
+        <w:t xml:space="preserve">Figur 7.6: LightGBM gain-importance (fallback for SHAP, jf. § 9.7) — relativ styrke per feature i ensemble</w:t>
       </w:r>
       <w:r>
         <w:rPr>
@@ -17339,21 +17462,7 @@
           <w:rFonts w:ascii="Times New Roman" w:hAnsi="Times New Roman" w:cs="Times New Roman" w:eastAsia="Times New Roman"/>
           <w:sz w:val="24"/>
         </w:rPr>
-        <w:t xml:space="preserve">SHAP summary plot — viser effekt</w:t>
-      </w:r>
-      <w:r>
-        <w:rPr>
-          <w:rFonts w:ascii="Times New Roman" w:hAnsi="Times New Roman" w:cs="Times New Roman" w:eastAsia="Times New Roman"/>
-          <w:sz w:val="24"/>
-        </w:rPr>
-        <w:softHyphen/>
-      </w:r>
-      <w:r>
-        <w:rPr>
-          <w:rFonts w:ascii="Times New Roman" w:hAnsi="Times New Roman" w:cs="Times New Roman" w:eastAsia="Times New Roman"/>
-          <w:sz w:val="24"/>
-        </w:rPr>
-        <w:t xml:space="preserve">retning og styrke per feature.</w:t>
+        <w:t xml:space="preserve">LightGBM gain-importance brukt som fallback for SHAP-summary (TreeSHAP-generering feilet på et</w:t>
       </w:r>
       <w:r>
         <w:rPr>
@@ -17368,6 +17477,42 @@
           <w:rFonts w:ascii="Times New Roman" w:hAnsi="Times New Roman" w:cs="Times New Roman" w:eastAsia="Times New Roman"/>
           <w:sz w:val="24"/>
         </w:rPr>
+        <w:t xml:space="preserve">categorical_feature</w:t>
+      </w:r>
+      <w:r>
+        <w:rPr>
+          <w:rFonts w:ascii="Times New Roman" w:hAnsi="Times New Roman" w:cs="Times New Roman" w:eastAsia="Times New Roman"/>
+          <w:sz w:val="24"/>
+        </w:rPr>
+        <w:t xml:space="preserve">-mismatch, jf. § 9.7). Figuren viser relativ styrke (ikke effekt</w:t>
+      </w:r>
+      <w:r>
+        <w:rPr>
+          <w:rFonts w:ascii="Times New Roman" w:hAnsi="Times New Roman" w:cs="Times New Roman" w:eastAsia="Times New Roman"/>
+          <w:sz w:val="24"/>
+        </w:rPr>
+        <w:softHyphen/>
+      </w:r>
+      <w:r>
+        <w:rPr>
+          <w:rFonts w:ascii="Times New Roman" w:hAnsi="Times New Roman" w:cs="Times New Roman" w:eastAsia="Times New Roman"/>
+          <w:sz w:val="24"/>
+        </w:rPr>
+        <w:t xml:space="preserve">retning) per feature.</w:t>
+      </w:r>
+      <w:r>
+        <w:rPr>
+          <w:rFonts w:ascii="Times New Roman" w:hAnsi="Times New Roman" w:cs="Times New Roman" w:eastAsia="Times New Roman"/>
+          <w:sz w:val="24"/>
+        </w:rPr>
+        <w:t xml:space="preserve"> </w:t>
+      </w:r>
+      <w:r>
+        <w:rPr>
+          <w:rStyle w:val="VerbatimChar"/>
+          <w:rFonts w:ascii="Times New Roman" w:hAnsi="Times New Roman" w:cs="Times New Roman" w:eastAsia="Times New Roman"/>
+          <w:sz w:val="24"/>
+        </w:rPr>
         <w:t xml:space="preserve">service_type</w:t>
       </w:r>
       <w:r>
@@ -17491,35 +17636,21 @@
           <w:rFonts w:ascii="Times New Roman" w:hAnsi="Times New Roman" w:cs="Times New Roman" w:eastAsia="Times New Roman"/>
           <w:sz w:val="24"/>
         </w:rPr>
-        <w:t xml:space="preserve">som viktige sekundære drivere. Retnings</w:t>
-      </w:r>
-      <w:r>
-        <w:rPr>
-          <w:rFonts w:ascii="Times New Roman" w:hAnsi="Times New Roman" w:cs="Times New Roman" w:eastAsia="Times New Roman"/>
-          <w:sz w:val="24"/>
-        </w:rPr>
-        <w:softHyphen/>
-      </w:r>
-      <w:r>
-        <w:rPr>
-          <w:rFonts w:ascii="Times New Roman" w:hAnsi="Times New Roman" w:cs="Times New Roman" w:eastAsia="Times New Roman"/>
-          <w:sz w:val="24"/>
-        </w:rPr>
-        <w:t xml:space="preserve">strukturen er som forventet: høyere GT, lengre opphold og dyre</w:t>
-      </w:r>
-      <w:r>
-        <w:rPr>
-          <w:rFonts w:ascii="Times New Roman" w:hAnsi="Times New Roman" w:cs="Times New Roman" w:eastAsia="Times New Roman"/>
-          <w:sz w:val="24"/>
-        </w:rPr>
-        <w:softHyphen/>
-      </w:r>
-      <w:r>
-        <w:rPr>
-          <w:rFonts w:ascii="Times New Roman" w:hAnsi="Times New Roman" w:cs="Times New Roman" w:eastAsia="Times New Roman"/>
-          <w:sz w:val="24"/>
-        </w:rPr>
-        <w:t xml:space="preserve"> tjenestetyper (Provisioning, Port Marina) gir høyere predikert kostnad.</w:t>
+        <w:t xml:space="preserve">som viktige sekundære drivere. Et ekte SHAP-plott ville i tillegg gitt fortegns</w:t>
+      </w:r>
+      <w:r>
+        <w:rPr>
+          <w:rFonts w:ascii="Times New Roman" w:hAnsi="Times New Roman" w:cs="Times New Roman" w:eastAsia="Times New Roman"/>
+          <w:sz w:val="24"/>
+        </w:rPr>
+        <w:softHyphen/>
+      </w:r>
+      <w:r>
+        <w:rPr>
+          <w:rFonts w:ascii="Times New Roman" w:hAnsi="Times New Roman" w:cs="Times New Roman" w:eastAsia="Times New Roman"/>
+          <w:sz w:val="24"/>
+        </w:rPr>
+        <w:t xml:space="preserve">informasjon (positiv/negativ påvirkning på predikert kostnad) som denne proxyen ikke fanger — fortegnet er rekonstruert kvalitativt i teksten under: høyere GT, lengre opphold og dyre tjenestetyper (Provisioning, Port Marina) gir høyere predikert kostnad.</w:t>
       </w:r>
       <w:r>
         <w:rPr>
@@ -17563,7 +17694,7 @@
           <w:iCs/>
           <w:sz w:val="24"/>
         </w:rPr>
-        <w:t xml:space="preserve">, seksjon 10.)</w:t>
+        <w:t xml:space="preserve">, seksjon 10; regenerering med ekte TreeSHAP er flagget som videre arbeid.)</w:t>
       </w:r>
     </w:p>
     <w:p>
@@ -17580,18 +17711,18 @@
           <wp:inline>
             <wp:extent cx="5334000" cy="1660156"/>
             <wp:effectExtent b="0" l="0" r="0" t="0"/>
-            <wp:docPr descr="Figur 7.7: Predikerte kostnader fordelt på GT (log-skala), tjenestekategori og ankomsthavn — viser monoton GT-effekt og tydelig havne­variasjon" title="" id="66" name="Picture"/>
+            <wp:docPr descr="Figur 7.7: Predikerte kostnader fordelt på GT (log-skala), tjenestekategori og ankomsthavn — viser monoton GT-effekt og tydelig havne­variasjon" title="" id="67" name="Picture"/>
             <a:graphic>
               <a:graphicData uri="http://schemas.openxmlformats.org/drawingml/2006/picture">
                 <pic:pic>
                   <pic:nvPicPr>
-                    <pic:cNvPr descr="figures/figur_7_7_dependence.png" id="67" name="Picture"/>
+                    <pic:cNvPr descr="figures/figur_7_7_dependence.png" id="68" name="Picture"/>
                     <pic:cNvPicPr>
                       <a:picLocks noChangeArrowheads="1" noChangeAspect="1"/>
                     </pic:cNvPicPr>
                   </pic:nvPicPr>
                   <pic:blipFill>
-                    <a:blip r:embed="rId65"/>
+                    <a:blip r:embed="rId66"/>
                     <a:stretch>
                       <a:fillRect/>
                     </a:stretch>
@@ -17860,8 +17991,8 @@
         <w:t xml:space="preserve">.)</w:t>
       </w:r>
     </w:p>
-    <w:bookmarkEnd w:id="68"/>
-    <w:bookmarkStart w:id="72" w:name="residualdiagnostikk"/>
+    <w:bookmarkEnd w:id="69"/>
+    <w:bookmarkStart w:id="73" w:name="residualdiagnostikk"/>
     <w:p>
       <w:pPr>
         <w:pStyle w:val="Heading3"/>
@@ -17903,18 +18034,18 @@
           <wp:inline>
             <wp:extent cx="5334000" cy="2126429"/>
             <wp:effectExtent b="0" l="0" r="0" t="0"/>
-            <wp:docPr descr="Figur 7.8: Residualplott (predikert vs. faktisk i log-rom) på valideringssettet (n = 490, 2024) — bias ≈ −0,20 indikerer systematisk overprediksjon for lave fakturaer" title="" id="70" name="Picture"/>
+            <wp:docPr descr="Figur 7.8: Residualplott (predikert vs. faktisk i log-rom) på valideringssettet (n = 490, 2024) — bias ≈ −0,20 indikerer systematisk overprediksjon for lave fakturaer" title="" id="71" name="Picture"/>
             <a:graphic>
               <a:graphicData uri="http://schemas.openxmlformats.org/drawingml/2006/picture">
                 <pic:pic>
                   <pic:nvPicPr>
-                    <pic:cNvPr descr="figures/figur_7_8_residuals.png" id="71" name="Picture"/>
+                    <pic:cNvPr descr="figures/figur_7_8_residuals.png" id="72" name="Picture"/>
                     <pic:cNvPicPr>
                       <a:picLocks noChangeArrowheads="1" noChangeAspect="1"/>
                     </pic:cNvPicPr>
                   </pic:nvPicPr>
                   <pic:blipFill>
-                    <a:blip r:embed="rId69"/>
+                    <a:blip r:embed="rId70"/>
                     <a:stretch>
                       <a:fillRect/>
                     </a:stretch>
@@ -18643,9 +18774,9 @@
         </w:pict>
       </w:r>
     </w:p>
-    <w:bookmarkEnd w:id="72"/>
     <w:bookmarkEnd w:id="73"/>
-    <w:bookmarkStart w:id="79" w:name="resultat"/>
+    <w:bookmarkEnd w:id="74"/>
+    <w:bookmarkStart w:id="80" w:name="resultat"/>
     <w:p>
       <w:pPr>
         <w:pStyle w:val="Heading2"/>
@@ -18659,7 +18790,7 @@
         <w:t xml:space="preserve">8. Resultat</w:t>
       </w:r>
     </w:p>
-    <w:bookmarkStart w:id="74" w:name="X9e63db4d73416036d6c4aff3da2d7ddb8b5d91f"/>
+    <w:bookmarkStart w:id="75" w:name="X9e63db4d73416036d6c4aff3da2d7ddb8b5d91f"/>
     <w:p>
       <w:pPr>
         <w:pStyle w:val="Heading3"/>
@@ -20288,8 +20419,8 @@
         <w:t xml:space="preserve">båndet.</w:t>
       </w:r>
     </w:p>
-    <w:bookmarkEnd w:id="74"/>
-    <w:bookmarkStart w:id="75" w:name="endelig-evaluering-på-testsettet-2025"/>
+    <w:bookmarkEnd w:id="75"/>
+    <w:bookmarkStart w:id="76" w:name="endelig-evaluering-på-testsettet-2025"/>
     <w:p>
       <w:pPr>
         <w:pStyle w:val="Heading3"/>
@@ -21828,8 +21959,8 @@
         <w:t xml:space="preserve">(G10/Julie, 2026-05-07).</w:t>
       </w:r>
     </w:p>
-    <w:bookmarkEnd w:id="75"/>
-    <w:bookmarkStart w:id="76" w:name="kvantildekning"/>
+    <w:bookmarkEnd w:id="76"/>
+    <w:bookmarkStart w:id="77" w:name="kvantildekning"/>
     <w:p>
       <w:pPr>
         <w:pStyle w:val="Heading3"/>
@@ -21930,8 +22061,8 @@
         <w:t xml:space="preserve">etter CQR-justering. Per størrelseskategori varierer dekningen modest: Liten 83,0 % (n = 159), Mellomstor 74,3 % (n = 113) og Stor 80,7 % (n = 218). Mellomstor-gruppa er litt under nominelt nivå, hvilket er konsistent med at mellomstore yachter har færrest treningsrader (jf. §9.4).</w:t>
       </w:r>
     </w:p>
-    <w:bookmarkEnd w:id="76"/>
-    <w:bookmarkStart w:id="77" w:name="hybridkalibrert-anløpsestimat-eksempler"/>
+    <w:bookmarkEnd w:id="77"/>
+    <w:bookmarkStart w:id="78" w:name="hybridkalibrert-anløpsestimat-eksempler"/>
     <w:p>
       <w:pPr>
         <w:pStyle w:val="Heading3"/>
@@ -24258,8 +24389,8 @@
         <w:t xml:space="preserve">kostnad i tallene; modellen ser los som en sannsynlig linje, ikke som obligatorisk for LOA &gt; 70 m, jf. § 9.5.</w:t>
       </w:r>
     </w:p>
-    <w:bookmarkEnd w:id="77"/>
-    <w:bookmarkStart w:id="78" w:name="operasjonell-ytelse"/>
+    <w:bookmarkEnd w:id="78"/>
+    <w:bookmarkStart w:id="79" w:name="operasjonell-ytelse"/>
     <w:p>
       <w:pPr>
         <w:pStyle w:val="Heading3"/>
@@ -24344,9 +24475,9 @@
         </w:pict>
       </w:r>
     </w:p>
-    <w:bookmarkEnd w:id="78"/>
     <w:bookmarkEnd w:id="79"/>
-    <w:bookmarkStart w:id="96" w:name="diskusjon"/>
+    <w:bookmarkEnd w:id="80"/>
+    <w:bookmarkStart w:id="97" w:name="diskusjon"/>
     <w:p>
       <w:pPr>
         <w:pStyle w:val="Heading2"/>
@@ -24360,7 +24491,7 @@
         <w:t xml:space="preserve">9. Diskusjon</w:t>
       </w:r>
     </w:p>
-    <w:bookmarkStart w:id="80" w:name="tolkning-av-resultatene"/>
+    <w:bookmarkStart w:id="81" w:name="tolkning-av-resultatene"/>
     <w:p>
       <w:pPr>
         <w:pStyle w:val="Heading3"/>
@@ -24659,8 +24790,8 @@
         <w:t xml:space="preserve">estimatene (§ 8.3) som er den operasjonelle målestokken — der har medianestimatet plassert seg innenfor det historiske P25–P75-båndet i alle fem eksempler vi har testet, og det er den presisjonen som spiller størst rolle for agentkoordinator.</w:t>
       </w:r>
     </w:p>
-    <w:bookmarkEnd w:id="80"/>
-    <w:bookmarkStart w:id="81" w:name="X244671d3f5a9d81faac214b94d413d8f6763369"/>
+    <w:bookmarkEnd w:id="81"/>
+    <w:bookmarkStart w:id="82" w:name="X244671d3f5a9d81faac214b94d413d8f6763369"/>
     <w:p>
       <w:pPr>
         <w:pStyle w:val="Heading3"/>
@@ -25085,8 +25216,8 @@
         <w:t xml:space="preserve">) er fraværende fra feature-settet (§ 9.5.4), kan båndet være for smalt for noen kategorier (særlig Provisions); CQR korrigerer ikke for en manglende feature den ikke kan observere. Dette er den empiriske illustrasjonen av forskjellen mellom marginal og betinget dekning som § 1.5 punkt (ii) peker på som ett av studiens bidrag.</w:t>
       </w:r>
     </w:p>
-    <w:bookmarkEnd w:id="81"/>
-    <w:bookmarkStart w:id="82" w:name="modellens-styrker"/>
+    <w:bookmarkEnd w:id="82"/>
+    <w:bookmarkStart w:id="83" w:name="modellens-styrker"/>
     <w:p>
       <w:pPr>
         <w:pStyle w:val="Heading3"/>
@@ -25263,8 +25394,8 @@
         <w:t xml:space="preserve">tall fra tilfeldig split.</w:t>
       </w:r>
     </w:p>
-    <w:bookmarkEnd w:id="82"/>
-    <w:bookmarkStart w:id="83" w:name="X56aa68e323ecedcef833e61fdd58166787950c3"/>
+    <w:bookmarkEnd w:id="83"/>
+    <w:bookmarkStart w:id="84" w:name="X56aa68e323ecedcef833e61fdd58166787950c3"/>
     <w:p>
       <w:pPr>
         <w:pStyle w:val="Heading3"/>
@@ -27047,8 +27178,8 @@
         <w:t xml:space="preserve">.</w:t>
       </w:r>
     </w:p>
-    <w:bookmarkEnd w:id="83"/>
-    <w:bookmarkStart w:id="91" w:name="funn-fra-brukertest-mai-2026"/>
+    <w:bookmarkEnd w:id="84"/>
+    <w:bookmarkStart w:id="92" w:name="funn-fra-brukertest-mai-2026"/>
     <w:p>
       <w:pPr>
         <w:pStyle w:val="Heading3"/>
@@ -27131,7 +27262,7 @@
         <w:t xml:space="preserve">kontrollert.</w:t>
       </w:r>
     </w:p>
-    <w:bookmarkStart w:id="84" w:name="valutatagging-i-modelloutputen"/>
+    <w:bookmarkStart w:id="85" w:name="valutatagging-i-modelloutputen"/>
     <w:p>
       <w:pPr>
         <w:pStyle w:val="Heading4"/>
@@ -27274,8 +27405,8 @@
         <w:t xml:space="preserve">velger. Korreksjonen er drivkraften bak unit-relabelinga i resten av rapporten.</w:t>
       </w:r>
     </w:p>
-    <w:bookmarkEnd w:id="84"/>
-    <w:bookmarkStart w:id="85" w:name="Xb4132b2698e0fde9c17dbd99750016cd6b3278b"/>
+    <w:bookmarkEnd w:id="85"/>
+    <w:bookmarkStart w:id="86" w:name="Xb4132b2698e0fde9c17dbd99750016cd6b3278b"/>
     <w:p>
       <w:pPr>
         <w:pStyle w:val="Heading4"/>
@@ -27524,8 +27655,8 @@
         <w:t xml:space="preserve">-kategori. Riktig modellfix er størrelse-betingede sannsynligheter (videre arbeid punkt 8).</w:t>
       </w:r>
     </w:p>
-    <w:bookmarkEnd w:id="85"/>
-    <w:bookmarkStart w:id="86" w:name="bunkersmodellen-ser-ikke-reisegeometri"/>
+    <w:bookmarkEnd w:id="86"/>
+    <w:bookmarkStart w:id="87" w:name="bunkersmodellen-ser-ikke-reisegeometri"/>
     <w:p>
       <w:pPr>
         <w:pStyle w:val="Heading4"/>
@@ -27868,8 +27999,8 @@
         <w:t xml:space="preserve">(og marsjfart) som features i en re-trent modell — flagges som videre arbeid i § 10.</w:t>
       </w:r>
     </w:p>
-    <w:bookmarkEnd w:id="86"/>
-    <w:bookmarkStart w:id="87" w:name="manglende-guest_experience-feature"/>
+    <w:bookmarkEnd w:id="87"/>
+    <w:bookmarkStart w:id="88" w:name="manglende-guest_experience-feature"/>
     <w:p>
       <w:pPr>
         <w:pStyle w:val="Heading4"/>
@@ -28033,8 +28164,8 @@
         <w:t xml:space="preserve">) som lagres med registry-oppføringer for fremtidig re-trening; (b) en operasjonell rubrikk er foreslått i Vedlegg E, som må forfattes og signeres av Yachting Operations selv. Dette er det empiriske grunnlaget for § 1.5 punkt (ii) — CQR kompenserer ikke for en manglende feature.</w:t>
       </w:r>
     </w:p>
-    <w:bookmarkEnd w:id="87"/>
-    <w:bookmarkStart w:id="88" w:name="land-aggregater-i-modellen-er-poolet"/>
+    <w:bookmarkEnd w:id="88"/>
+    <w:bookmarkStart w:id="89" w:name="land-aggregater-i-modellen-er-poolet"/>
     <w:p>
       <w:pPr>
         <w:pStyle w:val="Heading4"/>
@@ -28263,8 +28394,8 @@
         <w:t xml:space="preserve">er nå synliggjort i API-respons og frontend.</w:t>
       </w:r>
     </w:p>
-    <w:bookmarkEnd w:id="88"/>
-    <w:bookmarkStart w:id="89" w:name="Xfb89bcd0f3196bce2464378960df46d55e2a129"/>
+    <w:bookmarkEnd w:id="89"/>
+    <w:bookmarkStart w:id="90" w:name="Xfb89bcd0f3196bce2464378960df46d55e2a129"/>
     <w:p>
       <w:pPr>
         <w:pStyle w:val="Heading4"/>
@@ -28443,8 +28574,8 @@
         <w:t xml:space="preserve">begrensninger.</w:t>
       </w:r>
     </w:p>
-    <w:bookmarkEnd w:id="89"/>
-    <w:bookmarkStart w:id="90" w:name="X5dd4a93841416e0d3a6753e4a56351cf7060d37"/>
+    <w:bookmarkEnd w:id="90"/>
+    <w:bookmarkStart w:id="91" w:name="X5dd4a93841416e0d3a6753e4a56351cf7060d37"/>
     <w:p>
       <w:pPr>
         <w:pStyle w:val="Heading4"/>
@@ -28581,9 +28712,9 @@
         <w:t xml:space="preserve">er observerbar. Provisions-feilen skal lukkes via labels + re-trening, ikke maskeres via UI.</w:t>
       </w:r>
     </w:p>
-    <w:bookmarkEnd w:id="90"/>
     <w:bookmarkEnd w:id="91"/>
-    <w:bookmarkStart w:id="92" w:name="validitet-og-generaliserbarhet"/>
+    <w:bookmarkEnd w:id="92"/>
+    <w:bookmarkStart w:id="93" w:name="validitet-og-generaliserbarhet"/>
     <w:p>
       <w:pPr>
         <w:pStyle w:val="Heading3"/>
@@ -29664,8 +29795,8 @@
         <w:t xml:space="preserve">ordener.</w:t>
       </w:r>
     </w:p>
-    <w:bookmarkEnd w:id="92"/>
-    <w:bookmarkStart w:id="93" w:name="refleksjon-over-prosessens-utfordringer"/>
+    <w:bookmarkEnd w:id="93"/>
+    <w:bookmarkStart w:id="94" w:name="refleksjon-over-prosessens-utfordringer"/>
     <w:p>
       <w:pPr>
         <w:pStyle w:val="Heading3"/>
@@ -30104,8 +30235,8 @@
         <w:t xml:space="preserve">“Begrensninger, usikkerhet og feilkilder er tydeliggjort.”</w:t>
       </w:r>
     </w:p>
-    <w:bookmarkEnd w:id="93"/>
-    <w:bookmarkStart w:id="94" w:name="praktiske-implikasjoner"/>
+    <w:bookmarkEnd w:id="94"/>
+    <w:bookmarkStart w:id="95" w:name="praktiske-implikasjoner"/>
     <w:p>
       <w:pPr>
         <w:pStyle w:val="Heading3"/>
@@ -30247,8 +30378,8 @@
         <w:t xml:space="preserve">korrigeres for kjente begrensninger uten å vente på en re-trening.</w:t>
       </w:r>
     </w:p>
-    <w:bookmarkEnd w:id="94"/>
-    <w:bookmarkStart w:id="95" w:name="etiske-og-personvernmessige-hensyn"/>
+    <w:bookmarkEnd w:id="95"/>
+    <w:bookmarkStart w:id="96" w:name="etiske-og-personvernmessige-hensyn"/>
     <w:p>
       <w:pPr>
         <w:pStyle w:val="Heading3"/>
@@ -30360,9 +30491,9 @@
         </w:pict>
       </w:r>
     </w:p>
-    <w:bookmarkEnd w:id="95"/>
     <w:bookmarkEnd w:id="96"/>
-    <w:bookmarkStart w:id="97" w:name="konklusjon"/>
+    <w:bookmarkEnd w:id="97"/>
+    <w:bookmarkStart w:id="98" w:name="konklusjon"/>
     <w:p>
       <w:pPr>
         <w:pStyle w:val="Heading2"/>
@@ -30832,8 +30963,8 @@
         </w:pict>
       </w:r>
     </w:p>
-    <w:bookmarkEnd w:id="97"/>
-    <w:bookmarkStart w:id="98" w:name="bibliografi"/>
+    <w:bookmarkEnd w:id="98"/>
+    <w:bookmarkStart w:id="99" w:name="bibliografi"/>
     <w:p>
       <w:pPr>
         <w:pStyle w:val="Heading2"/>
@@ -30857,7 +30988,7 @@
           <w:rFonts w:ascii="Times New Roman" w:hAnsi="Times New Roman" w:cs="Times New Roman" w:eastAsia="Times New Roman"/>
           <w:sz w:val="24"/>
         </w:rPr>
-        <w:t xml:space="preserve">Su, M., Lee, H. J., Wang, X., &amp; Bae, S.-H. (2024). Fuel consumption cost prediction model for ro-ro carriers: A machine learning-based application.</w:t>
+        <w:t xml:space="preserve">Friedman, J. H. (2001). Greedy function approximation: A gradient boosting machine.</w:t>
       </w:r>
       <w:r>
         <w:rPr>
@@ -30873,7 +31004,7 @@
           <w:iCs/>
           <w:sz w:val="24"/>
         </w:rPr>
-        <w:t xml:space="preserve">Maritime Policy &amp; Management</w:t>
+        <w:t xml:space="preserve">The Annals of Statistics</w:t>
       </w:r>
       <w:r>
         <w:rPr>
@@ -30896,14 +31027,14 @@
           <w:iCs/>
           <w:sz w:val="24"/>
         </w:rPr>
-        <w:t xml:space="preserve">52</w:t>
-      </w:r>
-      <w:r>
-        <w:rPr>
-          <w:rFonts w:ascii="Times New Roman" w:hAnsi="Times New Roman" w:cs="Times New Roman" w:eastAsia="Times New Roman"/>
-          <w:sz w:val="24"/>
-        </w:rPr>
-        <w:t xml:space="preserve">(2), 229–249. https://doi.org/10.1080/03088839.2024.2303120</w:t>
+        <w:t xml:space="preserve">29</w:t>
+      </w:r>
+      <w:r>
+        <w:rPr>
+          <w:rFonts w:ascii="Times New Roman" w:hAnsi="Times New Roman" w:cs="Times New Roman" w:eastAsia="Times New Roman"/>
+          <w:sz w:val="24"/>
+        </w:rPr>
+        <w:t xml:space="preserve">(5), 1189–1232. https://doi.org/10.1214/aos/1013203451</w:t>
       </w:r>
     </w:p>
     <w:p>
@@ -30916,7 +31047,7 @@
           <w:rFonts w:ascii="Times New Roman" w:hAnsi="Times New Roman" w:cs="Times New Roman" w:eastAsia="Times New Roman"/>
           <w:sz w:val="24"/>
         </w:rPr>
-        <w:t xml:space="preserve">Friedman, J. H. (2001). Greedy function approximation: A gradient boosting machine.</w:t>
+        <w:t xml:space="preserve">Grinsztajn, L., Oyallon, E., &amp; Varoquaux, G. (2022). Why do tree-based models still outperform deep learning on typical tabular data?</w:t>
       </w:r>
       <w:r>
         <w:rPr>
@@ -30932,14 +31063,27 @@
           <w:iCs/>
           <w:sz w:val="24"/>
         </w:rPr>
-        <w:t xml:space="preserve">The Annals of Statistics</w:t>
-      </w:r>
-      <w:r>
-        <w:rPr>
-          <w:rFonts w:ascii="Times New Roman" w:hAnsi="Times New Roman" w:cs="Times New Roman" w:eastAsia="Times New Roman"/>
-          <w:sz w:val="24"/>
-        </w:rPr>
-        <w:t xml:space="preserve">,</w:t>
+        <w:t xml:space="preserve">Advances in Neural Information Processing Systems, 35</w:t>
+      </w:r>
+      <w:r>
+        <w:rPr>
+          <w:rFonts w:ascii="Times New Roman" w:hAnsi="Times New Roman" w:cs="Times New Roman" w:eastAsia="Times New Roman"/>
+          <w:sz w:val="24"/>
+        </w:rPr>
+        <w:t xml:space="preserve">, 507–520.</w:t>
+      </w:r>
+    </w:p>
+    <w:p>
+      <w:pPr>
+        <w:pStyle w:val="BodyText"/>
+        <w:spacing w:line="360" w:lineRule="auto"/>
+      </w:pPr>
+      <w:r>
+        <w:rPr>
+          <w:rFonts w:ascii="Times New Roman" w:hAnsi="Times New Roman" w:cs="Times New Roman" w:eastAsia="Times New Roman"/>
+          <w:sz w:val="24"/>
+        </w:rPr>
+        <w:t xml:space="preserve">Hastie, T., Tibshirani, R., &amp; Friedman, J. (2009).</w:t>
       </w:r>
       <w:r>
         <w:rPr>
@@ -30955,14 +31099,21 @@
           <w:iCs/>
           <w:sz w:val="24"/>
         </w:rPr>
-        <w:t xml:space="preserve">29</w:t>
-      </w:r>
-      <w:r>
-        <w:rPr>
-          <w:rFonts w:ascii="Times New Roman" w:hAnsi="Times New Roman" w:cs="Times New Roman" w:eastAsia="Times New Roman"/>
-          <w:sz w:val="24"/>
-        </w:rPr>
-        <w:t xml:space="preserve">(5), 1189–1232. https://doi.org/10.1214/aos/1013203451</w:t>
+        <w:t xml:space="preserve">The Elements of Statistical Learning: Data Mining, Inference, and Prediction</w:t>
+      </w:r>
+      <w:r>
+        <w:rPr>
+          <w:rFonts w:ascii="Times New Roman" w:hAnsi="Times New Roman" w:cs="Times New Roman" w:eastAsia="Times New Roman"/>
+          <w:sz w:val="24"/>
+        </w:rPr>
+        <w:t xml:space="preserve"> </w:t>
+      </w:r>
+      <w:r>
+        <w:rPr>
+          <w:rFonts w:ascii="Times New Roman" w:hAnsi="Times New Roman" w:cs="Times New Roman" w:eastAsia="Times New Roman"/>
+          <w:sz w:val="24"/>
+        </w:rPr>
+        <w:t xml:space="preserve">(2nd ed.). Springer. https://doi.org/10.1007/978-0-387-84858-7</w:t>
       </w:r>
     </w:p>
     <w:p>
@@ -31034,7 +31185,7 @@
           <w:rFonts w:ascii="Times New Roman" w:hAnsi="Times New Roman" w:cs="Times New Roman" w:eastAsia="Times New Roman"/>
           <w:sz w:val="24"/>
         </w:rPr>
-        <w:t xml:space="preserve">Grinsztajn, L., Oyallon, E., &amp; Varoquaux, G. (2022). Why do tree-based models still outperform deep learning on typical tabular data?</w:t>
+        <w:t xml:space="preserve">Jang, H.-S., Chang, T.-W., &amp; Kim, S.-H. (2023). Prediction of shipping cost on freight brokerage platform using machine learning.</w:t>
       </w:r>
       <w:r>
         <w:rPr>
@@ -31050,27 +31201,14 @@
           <w:iCs/>
           <w:sz w:val="24"/>
         </w:rPr>
-        <w:t xml:space="preserve">Advances in Neural Information Processing Systems, 35</w:t>
-      </w:r>
-      <w:r>
-        <w:rPr>
-          <w:rFonts w:ascii="Times New Roman" w:hAnsi="Times New Roman" w:cs="Times New Roman" w:eastAsia="Times New Roman"/>
-          <w:sz w:val="24"/>
-        </w:rPr>
-        <w:t xml:space="preserve">, 507–520.</w:t>
-      </w:r>
-    </w:p>
-    <w:p>
-      <w:pPr>
-        <w:pStyle w:val="BodyText"/>
-        <w:spacing w:line="360" w:lineRule="auto"/>
-      </w:pPr>
-      <w:r>
-        <w:rPr>
-          <w:rFonts w:ascii="Times New Roman" w:hAnsi="Times New Roman" w:cs="Times New Roman" w:eastAsia="Times New Roman"/>
-          <w:sz w:val="24"/>
-        </w:rPr>
-        <w:t xml:space="preserve">Hastie, T., Tibshirani, R., &amp; Friedman, J. (2009).</w:t>
+        <w:t xml:space="preserve">Sustainability</w:t>
+      </w:r>
+      <w:r>
+        <w:rPr>
+          <w:rFonts w:ascii="Times New Roman" w:hAnsi="Times New Roman" w:cs="Times New Roman" w:eastAsia="Times New Roman"/>
+          <w:sz w:val="24"/>
+        </w:rPr>
+        <w:t xml:space="preserve">,</w:t>
       </w:r>
       <w:r>
         <w:rPr>
@@ -31086,21 +31224,14 @@
           <w:iCs/>
           <w:sz w:val="24"/>
         </w:rPr>
-        <w:t xml:space="preserve">The Elements of Statistical Learning: Data Mining, Inference, and Prediction</w:t>
-      </w:r>
-      <w:r>
-        <w:rPr>
-          <w:rFonts w:ascii="Times New Roman" w:hAnsi="Times New Roman" w:cs="Times New Roman" w:eastAsia="Times New Roman"/>
-          <w:sz w:val="24"/>
-        </w:rPr>
-        <w:t xml:space="preserve"> </w:t>
-      </w:r>
-      <w:r>
-        <w:rPr>
-          <w:rFonts w:ascii="Times New Roman" w:hAnsi="Times New Roman" w:cs="Times New Roman" w:eastAsia="Times New Roman"/>
-          <w:sz w:val="24"/>
-        </w:rPr>
-        <w:t xml:space="preserve">(2nd ed.). Springer. https://doi.org/10.1007/978-0-387-84858-7</w:t>
+        <w:t xml:space="preserve">15</w:t>
+      </w:r>
+      <w:r>
+        <w:rPr>
+          <w:rFonts w:ascii="Times New Roman" w:hAnsi="Times New Roman" w:cs="Times New Roman" w:eastAsia="Times New Roman"/>
+          <w:sz w:val="24"/>
+        </w:rPr>
+        <w:t xml:space="preserve">(2), 1122. https://doi.org/10.3390/su15021122</w:t>
       </w:r>
     </w:p>
     <w:p>
@@ -31113,7 +31244,7 @@
           <w:rFonts w:ascii="Times New Roman" w:hAnsi="Times New Roman" w:cs="Times New Roman" w:eastAsia="Times New Roman"/>
           <w:sz w:val="24"/>
         </w:rPr>
-        <w:t xml:space="preserve">Jang, H.-S., Chang, T.-W., &amp; Kim, S.-H. (2023). Prediction of shipping cost on freight brokerage platform using machine learning.</w:t>
+        <w:t xml:space="preserve">Ke, G., Meng, Q., Finley, T., Wang, T., Chen, W., Ma, W., Ye, Q., &amp; Liu, T.-Y. (2017). LightGBM: A highly efficient gradient boosting decision tree.</w:t>
       </w:r>
       <w:r>
         <w:rPr>
@@ -31129,14 +31260,27 @@
           <w:iCs/>
           <w:sz w:val="24"/>
         </w:rPr>
-        <w:t xml:space="preserve">Sustainability</w:t>
-      </w:r>
-      <w:r>
-        <w:rPr>
-          <w:rFonts w:ascii="Times New Roman" w:hAnsi="Times New Roman" w:cs="Times New Roman" w:eastAsia="Times New Roman"/>
-          <w:sz w:val="24"/>
-        </w:rPr>
-        <w:t xml:space="preserve">,</w:t>
+        <w:t xml:space="preserve">Advances in Neural Information Processing Systems, 30</w:t>
+      </w:r>
+      <w:r>
+        <w:rPr>
+          <w:rFonts w:ascii="Times New Roman" w:hAnsi="Times New Roman" w:cs="Times New Roman" w:eastAsia="Times New Roman"/>
+          <w:sz w:val="24"/>
+        </w:rPr>
+        <w:t xml:space="preserve">, 3146–3154.</w:t>
+      </w:r>
+    </w:p>
+    <w:p>
+      <w:pPr>
+        <w:pStyle w:val="BodyText"/>
+        <w:spacing w:line="360" w:lineRule="auto"/>
+      </w:pPr>
+      <w:r>
+        <w:rPr>
+          <w:rFonts w:ascii="Times New Roman" w:hAnsi="Times New Roman" w:cs="Times New Roman" w:eastAsia="Times New Roman"/>
+          <w:sz w:val="24"/>
+        </w:rPr>
+        <w:t xml:space="preserve">Lundberg, S. M., Erion, G., Chen, H., DeGrave, A., Prutkin, J. M., Nair, B., Katz, R., Himmelfarb, J., Bansal, N., &amp; Lee, S.-I. (2020). From local explanations to global understanding with explainable AI for trees.</w:t>
       </w:r>
       <w:r>
         <w:rPr>
@@ -31152,27 +31296,14 @@
           <w:iCs/>
           <w:sz w:val="24"/>
         </w:rPr>
-        <w:t xml:space="preserve">15</w:t>
-      </w:r>
-      <w:r>
-        <w:rPr>
-          <w:rFonts w:ascii="Times New Roman" w:hAnsi="Times New Roman" w:cs="Times New Roman" w:eastAsia="Times New Roman"/>
-          <w:sz w:val="24"/>
-        </w:rPr>
-        <w:t xml:space="preserve">(2), 1122. https://doi.org/10.3390/su15021122</w:t>
-      </w:r>
-    </w:p>
-    <w:p>
-      <w:pPr>
-        <w:pStyle w:val="BodyText"/>
-        <w:spacing w:line="360" w:lineRule="auto"/>
-      </w:pPr>
-      <w:r>
-        <w:rPr>
-          <w:rFonts w:ascii="Times New Roman" w:hAnsi="Times New Roman" w:cs="Times New Roman" w:eastAsia="Times New Roman"/>
-          <w:sz w:val="24"/>
-        </w:rPr>
-        <w:t xml:space="preserve">Ke, G., Meng, Q., Finley, T., Wang, T., Chen, W., Ma, W., Ye, Q., &amp; Liu, T.-Y. (2017). LightGBM: A highly efficient gradient boosting decision tree.</w:t>
+        <w:t xml:space="preserve">Nature Machine Intelligence</w:t>
+      </w:r>
+      <w:r>
+        <w:rPr>
+          <w:rFonts w:ascii="Times New Roman" w:hAnsi="Times New Roman" w:cs="Times New Roman" w:eastAsia="Times New Roman"/>
+          <w:sz w:val="24"/>
+        </w:rPr>
+        <w:t xml:space="preserve">,</w:t>
       </w:r>
       <w:r>
         <w:rPr>
@@ -31188,14 +31319,14 @@
           <w:iCs/>
           <w:sz w:val="24"/>
         </w:rPr>
-        <w:t xml:space="preserve">Advances in Neural Information Processing Systems, 30</w:t>
-      </w:r>
-      <w:r>
-        <w:rPr>
-          <w:rFonts w:ascii="Times New Roman" w:hAnsi="Times New Roman" w:cs="Times New Roman" w:eastAsia="Times New Roman"/>
-          <w:sz w:val="24"/>
-        </w:rPr>
-        <w:t xml:space="preserve">, 3146–3154.</w:t>
+        <w:t xml:space="preserve">2</w:t>
+      </w:r>
+      <w:r>
+        <w:rPr>
+          <w:rFonts w:ascii="Times New Roman" w:hAnsi="Times New Roman" w:cs="Times New Roman" w:eastAsia="Times New Roman"/>
+          <w:sz w:val="24"/>
+        </w:rPr>
+        <w:t xml:space="preserve">(1), 56–67. https://doi.org/10.1038/s42256-019-0138-9</w:t>
       </w:r>
     </w:p>
     <w:p>
@@ -31244,7 +31375,7 @@
           <w:rFonts w:ascii="Times New Roman" w:hAnsi="Times New Roman" w:cs="Times New Roman" w:eastAsia="Times New Roman"/>
           <w:sz w:val="24"/>
         </w:rPr>
-        <w:t xml:space="preserve">Lundberg, S. M., Erion, G., Chen, H., DeGrave, A., Prutkin, J. M., Nair, B., Katz, R., Himmelfarb, J., Bansal, N., &amp; Lee, S.-I. (2020). From local explanations to global understanding with explainable AI for trees.</w:t>
+        <w:t xml:space="preserve">Pettersen, B.-I., &amp; Rekdal, P. K. (2026).</w:t>
       </w:r>
       <w:r>
         <w:rPr>
@@ -31260,14 +31391,34 @@
           <w:iCs/>
           <w:sz w:val="24"/>
         </w:rPr>
-        <w:t xml:space="preserve">Nature Machine Intelligence</w:t>
-      </w:r>
-      <w:r>
-        <w:rPr>
-          <w:rFonts w:ascii="Times New Roman" w:hAnsi="Times New Roman" w:cs="Times New Roman" w:eastAsia="Times New Roman"/>
-          <w:sz w:val="24"/>
-        </w:rPr>
-        <w:t xml:space="preserve">,</w:t>
+        <w:t xml:space="preserve">Kvantitative metoder i logistikk — implementert via KI</w:t>
+      </w:r>
+      <w:r>
+        <w:rPr>
+          <w:rFonts w:ascii="Times New Roman" w:hAnsi="Times New Roman" w:cs="Times New Roman" w:eastAsia="Times New Roman"/>
+          <w:sz w:val="24"/>
+        </w:rPr>
+        <w:t xml:space="preserve"> </w:t>
+      </w:r>
+      <w:r>
+        <w:rPr>
+          <w:rFonts w:ascii="Times New Roman" w:hAnsi="Times New Roman" w:cs="Times New Roman" w:eastAsia="Times New Roman"/>
+          <w:sz w:val="24"/>
+        </w:rPr>
+        <w:t xml:space="preserve">[Kompendium]. LOG650 Forskningsprosjekt: Logistikk og kunstig intelligens, Høgskolen i Molde.</w:t>
+      </w:r>
+    </w:p>
+    <w:p>
+      <w:pPr>
+        <w:pStyle w:val="BodyText"/>
+        <w:spacing w:line="360" w:lineRule="auto"/>
+      </w:pPr>
+      <w:r>
+        <w:rPr>
+          <w:rFonts w:ascii="Times New Roman" w:hAnsi="Times New Roman" w:cs="Times New Roman" w:eastAsia="Times New Roman"/>
+          <w:sz w:val="24"/>
+        </w:rPr>
+        <w:t xml:space="preserve">Prokhorenkova, L., Gusev, G., Vorobev, A., Dorogush, A. V., &amp; Gulin, A. (2018). CatBoost: Unbiased boosting with categorical features.</w:t>
       </w:r>
       <w:r>
         <w:rPr>
@@ -31283,14 +31434,14 @@
           <w:iCs/>
           <w:sz w:val="24"/>
         </w:rPr>
-        <w:t xml:space="preserve">2</w:t>
-      </w:r>
-      <w:r>
-        <w:rPr>
-          <w:rFonts w:ascii="Times New Roman" w:hAnsi="Times New Roman" w:cs="Times New Roman" w:eastAsia="Times New Roman"/>
-          <w:sz w:val="24"/>
-        </w:rPr>
-        <w:t xml:space="preserve">(1), 56–67. https://doi.org/10.1038/s42256-019-0138-9</w:t>
+        <w:t xml:space="preserve">Advances in Neural Information Processing Systems, 31</w:t>
+      </w:r>
+      <w:r>
+        <w:rPr>
+          <w:rFonts w:ascii="Times New Roman" w:hAnsi="Times New Roman" w:cs="Times New Roman" w:eastAsia="Times New Roman"/>
+          <w:sz w:val="24"/>
+        </w:rPr>
+        <w:t xml:space="preserve">, 6638–6648.</w:t>
       </w:r>
     </w:p>
     <w:p>
@@ -31303,7 +31454,7 @@
           <w:rFonts w:ascii="Times New Roman" w:hAnsi="Times New Roman" w:cs="Times New Roman" w:eastAsia="Times New Roman"/>
           <w:sz w:val="24"/>
         </w:rPr>
-        <w:t xml:space="preserve">Pettersen, B.-I., &amp; Rekdal, P. K. (2026).</w:t>
+        <w:t xml:space="preserve">Romano, Y., Patterson, E., &amp; Candès, E. (2019). Conformalized quantile regression.</w:t>
       </w:r>
       <w:r>
         <w:rPr>
@@ -31319,21 +31470,14 @@
           <w:iCs/>
           <w:sz w:val="24"/>
         </w:rPr>
-        <w:t xml:space="preserve">Kvantitative metoder i logistikk — implementert via KI</w:t>
-      </w:r>
-      <w:r>
-        <w:rPr>
-          <w:rFonts w:ascii="Times New Roman" w:hAnsi="Times New Roman" w:cs="Times New Roman" w:eastAsia="Times New Roman"/>
-          <w:sz w:val="24"/>
-        </w:rPr>
-        <w:t xml:space="preserve"> </w:t>
-      </w:r>
-      <w:r>
-        <w:rPr>
-          <w:rFonts w:ascii="Times New Roman" w:hAnsi="Times New Roman" w:cs="Times New Roman" w:eastAsia="Times New Roman"/>
-          <w:sz w:val="24"/>
-        </w:rPr>
-        <w:t xml:space="preserve">[Kompendium]. LOG650 Forskningsprosjekt: Logistikk og kunstig intelligens, Høgskolen i Molde.</w:t>
+        <w:t xml:space="preserve">Advances in Neural Information Processing Systems, 32</w:t>
+      </w:r>
+      <w:r>
+        <w:rPr>
+          <w:rFonts w:ascii="Times New Roman" w:hAnsi="Times New Roman" w:cs="Times New Roman" w:eastAsia="Times New Roman"/>
+          <w:sz w:val="24"/>
+        </w:rPr>
+        <w:t xml:space="preserve">, 3543–3553.</w:t>
       </w:r>
     </w:p>
     <w:p>
@@ -31346,7 +31490,7 @@
           <w:rFonts w:ascii="Times New Roman" w:hAnsi="Times New Roman" w:cs="Times New Roman" w:eastAsia="Times New Roman"/>
           <w:sz w:val="24"/>
         </w:rPr>
-        <w:t xml:space="preserve">Prokhorenkova, L., Gusev, G., Vorobev, A., Dorogush, A. V., &amp; Gulin, A. (2018). CatBoost: Unbiased boosting with categorical features.</w:t>
+        <w:t xml:space="preserve">Shafer, G., &amp; Vovk, V. (2008). A tutorial on conformal prediction.</w:t>
       </w:r>
       <w:r>
         <w:rPr>
@@ -31362,27 +31506,14 @@
           <w:iCs/>
           <w:sz w:val="24"/>
         </w:rPr>
-        <w:t xml:space="preserve">Advances in Neural Information Processing Systems, 31</w:t>
-      </w:r>
-      <w:r>
-        <w:rPr>
-          <w:rFonts w:ascii="Times New Roman" w:hAnsi="Times New Roman" w:cs="Times New Roman" w:eastAsia="Times New Roman"/>
-          <w:sz w:val="24"/>
-        </w:rPr>
-        <w:t xml:space="preserve">, 6638–6648.</w:t>
-      </w:r>
-    </w:p>
-    <w:p>
-      <w:pPr>
-        <w:pStyle w:val="BodyText"/>
-        <w:spacing w:line="360" w:lineRule="auto"/>
-      </w:pPr>
-      <w:r>
-        <w:rPr>
-          <w:rFonts w:ascii="Times New Roman" w:hAnsi="Times New Roman" w:cs="Times New Roman" w:eastAsia="Times New Roman"/>
-          <w:sz w:val="24"/>
-        </w:rPr>
-        <w:t xml:space="preserve">Romano, Y., Patterson, E., &amp; Candès, E. (2019). Conformalized quantile regression.</w:t>
+        <w:t xml:space="preserve">Journal of Machine Learning Research</w:t>
+      </w:r>
+      <w:r>
+        <w:rPr>
+          <w:rFonts w:ascii="Times New Roman" w:hAnsi="Times New Roman" w:cs="Times New Roman" w:eastAsia="Times New Roman"/>
+          <w:sz w:val="24"/>
+        </w:rPr>
+        <w:t xml:space="preserve">,</w:t>
       </w:r>
       <w:r>
         <w:rPr>
@@ -31398,14 +31529,14 @@
           <w:iCs/>
           <w:sz w:val="24"/>
         </w:rPr>
-        <w:t xml:space="preserve">Advances in Neural Information Processing Systems, 32</w:t>
-      </w:r>
-      <w:r>
-        <w:rPr>
-          <w:rFonts w:ascii="Times New Roman" w:hAnsi="Times New Roman" w:cs="Times New Roman" w:eastAsia="Times New Roman"/>
-          <w:sz w:val="24"/>
-        </w:rPr>
-        <w:t xml:space="preserve">, 3543–3553.</w:t>
+        <w:t xml:space="preserve">9</w:t>
+      </w:r>
+      <w:r>
+        <w:rPr>
+          <w:rFonts w:ascii="Times New Roman" w:hAnsi="Times New Roman" w:cs="Times New Roman" w:eastAsia="Times New Roman"/>
+          <w:sz w:val="24"/>
+        </w:rPr>
+        <w:t xml:space="preserve">, 371–421. https://jmlr.csail.mit.edu/papers/volume9/shafer08a/shafer08a.pdf</w:t>
       </w:r>
     </w:p>
     <w:p>
@@ -31418,7 +31549,7 @@
           <w:rFonts w:ascii="Times New Roman" w:hAnsi="Times New Roman" w:cs="Times New Roman" w:eastAsia="Times New Roman"/>
           <w:sz w:val="24"/>
         </w:rPr>
-        <w:t xml:space="preserve">Shafer, G., &amp; Vovk, V. (2008). A tutorial on conformal prediction.</w:t>
+        <w:t xml:space="preserve">Shwartz-Ziv, R., &amp; Armon, A. (2022). Tabular data: Deep learning is not all you need.</w:t>
       </w:r>
       <w:r>
         <w:rPr>
@@ -31434,7 +31565,7 @@
           <w:iCs/>
           <w:sz w:val="24"/>
         </w:rPr>
-        <w:t xml:space="preserve">Journal of Machine Learning Research</w:t>
+        <w:t xml:space="preserve">Information Fusion</w:t>
       </w:r>
       <w:r>
         <w:rPr>
@@ -31457,14 +31588,14 @@
           <w:iCs/>
           <w:sz w:val="24"/>
         </w:rPr>
-        <w:t xml:space="preserve">9</w:t>
-      </w:r>
-      <w:r>
-        <w:rPr>
-          <w:rFonts w:ascii="Times New Roman" w:hAnsi="Times New Roman" w:cs="Times New Roman" w:eastAsia="Times New Roman"/>
-          <w:sz w:val="24"/>
-        </w:rPr>
-        <w:t xml:space="preserve">, 371–421. https://jmlr.csail.mit.edu/papers/volume9/shafer08a/shafer08a.pdf</w:t>
+        <w:t xml:space="preserve">81</w:t>
+      </w:r>
+      <w:r>
+        <w:rPr>
+          <w:rFonts w:ascii="Times New Roman" w:hAnsi="Times New Roman" w:cs="Times New Roman" w:eastAsia="Times New Roman"/>
+          <w:sz w:val="24"/>
+        </w:rPr>
+        <w:t xml:space="preserve">, 84–90. https://doi.org/10.1016/j.inffus.2021.11.011</w:t>
       </w:r>
     </w:p>
     <w:p>
@@ -31477,7 +31608,7 @@
           <w:rFonts w:ascii="Times New Roman" w:hAnsi="Times New Roman" w:cs="Times New Roman" w:eastAsia="Times New Roman"/>
           <w:sz w:val="24"/>
         </w:rPr>
-        <w:t xml:space="preserve">Shwartz-Ziv, R., &amp; Armon, A. (2022). Tabular data: Deep learning is not all you need.</w:t>
+        <w:t xml:space="preserve">Su, M., Lee, H. J., Wang, X., &amp; Bae, S.-H. (2024). Fuel consumption cost prediction model for ro-ro carriers: A machine learning-based application.</w:t>
       </w:r>
       <w:r>
         <w:rPr>
@@ -31493,7 +31624,7 @@
           <w:iCs/>
           <w:sz w:val="24"/>
         </w:rPr>
-        <w:t xml:space="preserve">Information Fusion</w:t>
+        <w:t xml:space="preserve">Maritime Policy &amp; Management</w:t>
       </w:r>
       <w:r>
         <w:rPr>
@@ -31516,14 +31647,14 @@
           <w:iCs/>
           <w:sz w:val="24"/>
         </w:rPr>
-        <w:t xml:space="preserve">81</w:t>
-      </w:r>
-      <w:r>
-        <w:rPr>
-          <w:rFonts w:ascii="Times New Roman" w:hAnsi="Times New Roman" w:cs="Times New Roman" w:eastAsia="Times New Roman"/>
-          <w:sz w:val="24"/>
-        </w:rPr>
-        <w:t xml:space="preserve">, 84–90. https://doi.org/10.1016/j.inffus.2021.11.011</w:t>
+        <w:t xml:space="preserve">52</w:t>
+      </w:r>
+      <w:r>
+        <w:rPr>
+          <w:rFonts w:ascii="Times New Roman" w:hAnsi="Times New Roman" w:cs="Times New Roman" w:eastAsia="Times New Roman"/>
+          <w:sz w:val="24"/>
+        </w:rPr>
+        <w:t xml:space="preserve">(2), 229–249. https://doi.org/10.1080/03088839.2024.2303120</w:t>
       </w:r>
     </w:p>
     <w:p>
@@ -31540,8 +31671,8 @@
         </w:pict>
       </w:r>
     </w:p>
-    <w:bookmarkEnd w:id="98"/>
-    <w:bookmarkStart w:id="100" w:name="vedlegg"/>
+    <w:bookmarkEnd w:id="99"/>
+    <w:bookmarkStart w:id="101" w:name="vedlegg"/>
     <w:p>
       <w:pPr>
         <w:pStyle w:val="Heading2"/>
@@ -31979,7 +32110,7 @@
         <w:t xml:space="preserve">.</w:t>
       </w:r>
     </w:p>
-    <w:bookmarkStart w:id="99" w:name="Xe1f01a8cc6b3208ae7fb51104f9d9c075e3eeb5"/>
+    <w:bookmarkStart w:id="100" w:name="Xe1f01a8cc6b3208ae7fb51104f9d9c075e3eeb5"/>
     <w:p>
       <w:pPr>
         <w:pStyle w:val="Heading3"/>
@@ -32784,8 +32915,8 @@
         <w:t xml:space="preserve">dokument for re-trening, ikke en ettertanke.</w:t>
       </w:r>
     </w:p>
-    <w:bookmarkEnd w:id="99"/>
     <w:bookmarkEnd w:id="100"/>
+    <w:bookmarkEnd w:id="101"/>
     <w:sectPr>
       <w:footnotePr>
         <w:numRestart w:val="eachSect"/>

</xml_diff>

<commit_message>
Rapport v2.3: Yachting Operations -> SDK Shipping, anonymiser peer-reviewer
Endringer etter forfatter-kontroll:
- Selskapsnavn rettet fra "Yachting Operations" til "SDK Shipping"
  i alle 14 forekomster i rapporten + forsvarsforberedelsen.
- Takk til-seksjonen: "Julie (Gruppe 10)" -> "Gruppe 10". Tilsvarende
  "G10/Julie" -> "Gruppe 10" i § 8.1.1 og Vedlegg G.

Ordtelling uendret: 11 959 ord (41 under 12 000-grensen).

Co-Authored-By: Claude Opus 4.7 <noreply@anthropic.com>
</commit_message>
<xml_diff>
--- a/014 fase 4 - report/Final report second draft v1.docx
+++ b/014 fase 4 - report/Final report second draft v1.docx
@@ -645,7 +645,7 @@
           <w:rFonts w:ascii="Times New Roman" w:hAnsi="Times New Roman" w:cs="Times New Roman" w:eastAsia="Times New Roman"/>
           <w:sz w:val="24"/>
         </w:rPr>
-        <w:t xml:space="preserve">NautiCost er et beslutningsstøtteverktøy som estimerer totalkostnaden for et superyachthavneanløp i Norge, Sverige eller Danmark før yachten ankommer. Verktøyet baserer seg på 1 647 historiske tjenestetransaksjoner (2020–2025) fra Yachting Operations, koblet mot 17 yachters spesifikasjoner. Metodevalget er pensum</w:t>
+        <w:t xml:space="preserve">NautiCost er et beslutningsstøtteverktøy som estimerer totalkostnaden for et superyachthavneanløp i Norge, Sverige eller Danmark før yachten ankommer. Verktøyet baserer seg på 1 647 historiske tjenestetransaksjoner (2020–2025) fra SDK Shipping, koblet mot 17 yachters spesifikasjoner. Metodevalget er pensum</w:t>
       </w:r>
       <w:r>
         <w:rPr>
@@ -831,7 +831,7 @@
           <w:rFonts w:ascii="Times New Roman" w:hAnsi="Times New Roman" w:cs="Times New Roman" w:eastAsia="Times New Roman"/>
           <w:sz w:val="24"/>
         </w:rPr>
-        <w:t xml:space="preserve">yacht port call in Norway, Sweden or Denmark. Trained on 1,647 service transactions (2020–2025) from Yachting Operations covering 17 yachts, it follows a curriculum-anchored methodology (Pettersen &amp; Rekdal, 2026, Table 1.1): gradient boosting, cross-validation, SHAP and hyper</w:t>
+        <w:t xml:space="preserve">yacht port call in Norway, Sweden or Denmark. Trained on 1,647 service transactions (2020–2025) from SDK Shipping covering 17 yachts, it follows a curriculum-anchored methodology (Pettersen &amp; Rekdal, 2026, Table 1.1): gradient boosting, cross-validation, SHAP and hyper</w:t>
       </w:r>
       <w:r>
         <w:rPr>
@@ -963,7 +963,7 @@
           <w:bCs/>
           <w:sz w:val="24"/>
         </w:rPr>
-        <w:t xml:space="preserve">Yachting Operations</w:t>
+        <w:t xml:space="preserve">SDK Shipping</w:t>
       </w:r>
       <w:r>
         <w:rPr>
@@ -1081,7 +1081,7 @@
           <w:rFonts w:ascii="Times New Roman" w:hAnsi="Times New Roman" w:cs="Times New Roman" w:eastAsia="Times New Roman"/>
           <w:sz w:val="24"/>
         </w:rPr>
-        <w:t xml:space="preserve">for kompendiet og veiledning; metodevalget er direkte forankret i deres rammeverk (§ 2.2 og § 5.0). Takk til medstudent Julie (Gruppe 10) for peer-review 2026-05-07 — innspill sporet og lukket i Vedlegg G.</w:t>
+        <w:t xml:space="preserve">for kompendiet og veiledning; metodevalget er direkte forankret i deres rammeverk (§ 2.2 og § 5.0). Takk til Gruppe 10 for peer-review 2026-05-07 — innspill sporet og lukket i Vedlegg G.</w:t>
       </w:r>
     </w:p>
     <w:p>
@@ -1654,7 +1654,7 @@
           <w:rFonts w:ascii="Times New Roman" w:hAnsi="Times New Roman" w:cs="Times New Roman" w:eastAsia="Times New Roman"/>
           <w:sz w:val="24"/>
         </w:rPr>
-        <w:t xml:space="preserve">Hvilke variabler i Yachting Operations sine fakturaer og kjøpsord</w:t>
+        <w:t xml:space="preserve">Hvilke variabler i SDK Shipping sine fakturaer og kjøpsord</w:t>
       </w:r>
       <w:r>
         <w:rPr>
@@ -2073,7 +2073,7 @@
           <w:rFonts w:ascii="Times New Roman" w:hAnsi="Times New Roman" w:cs="Times New Roman" w:eastAsia="Times New Roman"/>
           <w:sz w:val="24"/>
         </w:rPr>
-        <w:t xml:space="preserve">Kildedata fra Yachting Operations er denominert i</w:t>
+        <w:t xml:space="preserve">Kildedata fra SDK Shipping er denominert i</w:t>
       </w:r>
       <w:r>
         <w:rPr>
@@ -2636,7 +2636,7 @@
           <w:rFonts w:ascii="Times New Roman" w:hAnsi="Times New Roman" w:cs="Times New Roman" w:eastAsia="Times New Roman"/>
           <w:sz w:val="24"/>
         </w:rPr>
-        <w:t xml:space="preserve">måter demonstrert på Yachting Operations sitt datasett, ikke generaliserte forsknings</w:t>
+        <w:t xml:space="preserve">måter demonstrert på SDK Shipping sitt datasett, ikke generaliserte forsknings</w:t>
       </w:r>
       <w:r>
         <w:rPr>
@@ -10451,7 +10451,7 @@
           <w:bCs/>
           <w:sz w:val="24"/>
         </w:rPr>
-        <w:t xml:space="preserve">Yachting Operations</w:t>
+        <w:t xml:space="preserve">SDK Shipping</w:t>
       </w:r>
       <w:r>
         <w:rPr>
@@ -22384,7 +22384,7 @@
           <w:rFonts w:ascii="Times New Roman" w:hAnsi="Times New Roman" w:cs="Times New Roman" w:eastAsia="Times New Roman"/>
           <w:sz w:val="24"/>
         </w:rPr>
-        <w:t xml:space="preserve">(G10/Julie, 2026-05-07).</w:t>
+        <w:t xml:space="preserve">(Gruppe 10, 2026-05-07).</w:t>
       </w:r>
     </w:p>
     <w:bookmarkEnd w:id="77"/>
@@ -28573,7 +28573,7 @@
           <w:rFonts w:ascii="Times New Roman" w:hAnsi="Times New Roman" w:cs="Times New Roman" w:eastAsia="Times New Roman"/>
           <w:sz w:val="24"/>
         </w:rPr>
-        <w:t xml:space="preserve">) som lagres med registry-oppføringer for fremtidig re-trening; (b) en operasjonell rubrikk er foreslått i Vedlegg E, som må forfattes og signeres av Yachting Operations selv. Dette er det empiriske grunnlaget for § 1.5 punkt (ii) — CQR kompenserer ikke for en manglende feature.</w:t>
+        <w:t xml:space="preserve">) som lagres med registry-oppføringer for fremtidig re-trening; (b) en operasjonell rubrikk er foreslått i Vedlegg E, som må forfattes og signeres av SDK Shipping selv. Dette er det empiriske grunnlaget for § 1.5 punkt (ii) — CQR kompenserer ikke for en manglende feature.</w:t>
       </w:r>
     </w:p>
     <w:bookmarkEnd w:id="89"/>
@@ -29261,7 +29261,7 @@
           <w:rFonts w:ascii="Times New Roman" w:hAnsi="Times New Roman" w:cs="Times New Roman" w:eastAsia="Times New Roman"/>
           <w:sz w:val="24"/>
         </w:rPr>
-        <w:t xml:space="preserve">. Variabelen er fakturabeløpet før moms slik det er registrert hos Yachting Operations, og fanger derfor agentens direkte tjeneste</w:t>
+        <w:t xml:space="preserve">. Variabelen er fakturabeløpet før moms slik det er registrert hos SDK Shipping, og fanger derfor agentens direkte tjeneste</w:t>
       </w:r>
       <w:r>
         <w:rPr>
@@ -29938,7 +29938,7 @@
           <w:rFonts w:ascii="Times New Roman" w:hAnsi="Times New Roman" w:cs="Times New Roman" w:eastAsia="Times New Roman"/>
           <w:sz w:val="24"/>
         </w:rPr>
-        <w:t xml:space="preserve">Modellen er trent kun på Yachting Operations sine fakturaer og fanger derfor denne agentens</w:t>
+        <w:t xml:space="preserve">Modellen er trent kun på SDK Shipping sine fakturaer og fanger derfor denne agentens</w:t>
       </w:r>
       <w:r>
         <w:rPr>
@@ -30118,7 +30118,7 @@
           <w:rFonts w:ascii="Times New Roman" w:hAnsi="Times New Roman" w:cs="Times New Roman" w:eastAsia="Times New Roman"/>
           <w:sz w:val="24"/>
         </w:rPr>
-        <w:t xml:space="preserve">for Yachting Operations sine egne fremtidige anløp innenfor 12–18 måneder, men</w:t>
+        <w:t xml:space="preserve">for SDK Shipping sine egne fremtidige anløp innenfor 12–18 måneder, men</w:t>
       </w:r>
       <w:r>
         <w:rPr>
@@ -30232,7 +30232,7 @@
           <w:rFonts w:ascii="Times New Roman" w:hAnsi="Times New Roman" w:cs="Times New Roman" w:eastAsia="Times New Roman"/>
           <w:sz w:val="24"/>
         </w:rPr>
-        <w:t xml:space="preserve">For Yachting Operations betyr verktøyet at en agent</w:t>
+        <w:t xml:space="preserve">For SDK Shipping betyr verktøyet at en agent</w:t>
       </w:r>
       <w:r>
         <w:rPr>
@@ -30837,7 +30837,7 @@
           <w:rFonts w:ascii="Times New Roman" w:hAnsi="Times New Roman" w:cs="Times New Roman" w:eastAsia="Times New Roman"/>
           <w:sz w:val="24"/>
         </w:rPr>
-        <w:t xml:space="preserve">modellens generalisering. Ekstern validitet er begrenset til Yachting Operations. Provisions kan ikke lukkes uten</w:t>
+        <w:t xml:space="preserve">modellens generalisering. Ekstern validitet er begrenset til SDK Shipping. Provisions kan ikke lukkes uten</w:t>
       </w:r>
       <w:r>
         <w:rPr>
@@ -32858,7 +32858,7 @@
           <w:rFonts w:ascii="Times New Roman" w:hAnsi="Times New Roman" w:cs="Times New Roman" w:eastAsia="Times New Roman"/>
           <w:sz w:val="24"/>
         </w:rPr>
-        <w:t xml:space="preserve">, ikke en validert rubrikk. Den må forfattes og signeres av Yachting Operations selv før den tas i bruk operasjonelt. Dimensjonene og terskelverdiene over er valgt for å være observerbare</w:t>
+        <w:t xml:space="preserve">, ikke en validert rubrikk. Den må forfattes og signeres av SDK Shipping selv før den tas i bruk operasjonelt. Dimensjonene og terskelverdiene over er valgt for å være observerbare</w:t>
       </w:r>
       <w:r>
         <w:rPr>
@@ -33102,7 +33102,7 @@
           <w:bCs/>
           <w:sz w:val="24"/>
         </w:rPr>
-        <w:t xml:space="preserve">Peer review-respons (G10/Julie, 2026-05-07).</w:t>
+        <w:t xml:space="preserve">Peer review-respons (Gruppe 10, 2026-05-07).</w:t>
       </w:r>
       <w:r>
         <w:rPr>

</xml_diff>